<commit_message>
Sync Moodle materials, render Seaborn plots, and add ML solutions & audit plans
</commit_message>
<xml_diff>
--- a/05_BigData_Ingeniaritza/materialak/Ariketak_01_02_datuen_ingeniaritza.docx
+++ b/05_BigData_Ingeniaritza/materialak/Ariketak_01_02_datuen_ingeniaritza.docx
@@ -2091,6 +2091,7 @@
       </w:pPr>
       <w:r>
         <w:rPr>
+          <w:noProof/>
           <w:sz w:val="24"/>
           <w:szCs w:val="24"/>
         </w:rPr>
@@ -2460,6 +2461,7 @@
       </w:pPr>
       <w:r>
         <w:rPr>
+          <w:noProof/>
           <w:sz w:val="24"/>
           <w:szCs w:val="24"/>
         </w:rPr>
@@ -2541,6 +2543,7 @@
       </w:pPr>
       <w:r>
         <w:rPr>
+          <w:noProof/>
           <w:sz w:val="24"/>
           <w:szCs w:val="24"/>
         </w:rPr>
@@ -2777,6 +2780,12 @@
     </w:p>
     <w:p>
       <w:pPr>
+        <w:pStyle w:val="Zerrenda-paragrafoa"/>
+        <w:numPr>
+          <w:ilvl w:val="0"/>
+          <w:numId w:val="1"/>
+        </w:numPr>
+        <w:ind w:left="426"/>
         <w:jc w:val="both"/>
         <w:rPr>
           <w:b/>
@@ -2784,6 +2793,2694 @@
           <w:sz w:val="24"/>
           <w:szCs w:val="24"/>
           <w:u w:val="single"/>
+        </w:rPr>
+      </w:pPr>
+      <w:r>
+        <w:rPr>
+          <w:b/>
+          <w:bCs/>
+          <w:sz w:val="24"/>
+          <w:szCs w:val="24"/>
+          <w:u w:val="single"/>
+        </w:rPr>
+        <w:t>Zein formatu aukeratuko zenuke?</w:t>
+      </w:r>
+    </w:p>
+    <w:p>
+      <w:pPr>
+        <w:ind w:left="426"/>
+        <w:jc w:val="both"/>
+        <w:rPr>
+          <w:sz w:val="24"/>
+          <w:szCs w:val="24"/>
+        </w:rPr>
+      </w:pPr>
+      <w:r>
+        <w:rPr>
+          <w:sz w:val="24"/>
+          <w:szCs w:val="24"/>
+        </w:rPr>
+        <w:t xml:space="preserve">Kasu bakoitzean aukeratu formatu egokiena: CSV, JSON, JSONL edo </w:t>
+      </w:r>
+      <w:proofErr w:type="spellStart"/>
+      <w:r>
+        <w:rPr>
+          <w:sz w:val="24"/>
+          <w:szCs w:val="24"/>
+        </w:rPr>
+        <w:t>Parquet</w:t>
+      </w:r>
+      <w:proofErr w:type="spellEnd"/>
+      <w:r>
+        <w:rPr>
+          <w:sz w:val="24"/>
+          <w:szCs w:val="24"/>
+        </w:rPr>
+        <w:t>, eta erantzuna justifikatu.</w:t>
+      </w:r>
+    </w:p>
+    <w:p>
+      <w:pPr>
+        <w:pStyle w:val="Zerrenda-paragrafoa"/>
+        <w:numPr>
+          <w:ilvl w:val="1"/>
+          <w:numId w:val="1"/>
+        </w:numPr>
+        <w:ind w:left="993"/>
+        <w:jc w:val="both"/>
+        <w:rPr>
+          <w:sz w:val="24"/>
+          <w:szCs w:val="24"/>
+        </w:rPr>
+      </w:pPr>
+      <w:r>
+        <w:rPr>
+          <w:sz w:val="24"/>
+          <w:szCs w:val="24"/>
+        </w:rPr>
+        <w:t>Excel</w:t>
+      </w:r>
+      <w:r>
+        <w:rPr>
+          <w:sz w:val="24"/>
+          <w:szCs w:val="24"/>
+        </w:rPr>
+        <w:t>/</w:t>
+      </w:r>
+      <w:proofErr w:type="spellStart"/>
+      <w:r>
+        <w:rPr>
+          <w:sz w:val="24"/>
+          <w:szCs w:val="24"/>
+        </w:rPr>
+        <w:t>Calc-en</w:t>
+      </w:r>
+      <w:proofErr w:type="spellEnd"/>
+      <w:r>
+        <w:rPr>
+          <w:sz w:val="24"/>
+          <w:szCs w:val="24"/>
+        </w:rPr>
+        <w:t xml:space="preserve"> ireki behar den 500 erregistroko bezero-zerrenda.</w:t>
+      </w:r>
+    </w:p>
+    <w:p>
+      <w:pPr>
+        <w:pStyle w:val="Zerrenda-paragrafoa"/>
+        <w:numPr>
+          <w:ilvl w:val="1"/>
+          <w:numId w:val="1"/>
+        </w:numPr>
+        <w:ind w:left="993"/>
+        <w:jc w:val="both"/>
+        <w:rPr>
+          <w:sz w:val="24"/>
+          <w:szCs w:val="24"/>
+        </w:rPr>
+      </w:pPr>
+      <w:r>
+        <w:rPr>
+          <w:sz w:val="24"/>
+          <w:szCs w:val="24"/>
+        </w:rPr>
+        <w:t>API batek erabiltzaile baten informazioa bidaltzen du.</w:t>
+      </w:r>
+    </w:p>
+    <w:p>
+      <w:pPr>
+        <w:pStyle w:val="Zerrenda-paragrafoa"/>
+        <w:numPr>
+          <w:ilvl w:val="1"/>
+          <w:numId w:val="1"/>
+        </w:numPr>
+        <w:ind w:left="993"/>
+        <w:jc w:val="both"/>
+        <w:rPr>
+          <w:sz w:val="24"/>
+          <w:szCs w:val="24"/>
+        </w:rPr>
+      </w:pPr>
+      <w:r>
+        <w:rPr>
+          <w:sz w:val="24"/>
+          <w:szCs w:val="24"/>
+        </w:rPr>
+        <w:t>Zerbitzari batek etengabe log-erregistroak sortzen ditu eta banan-banan prozesatu nahi ditugu.</w:t>
+      </w:r>
+    </w:p>
+    <w:p>
+      <w:pPr>
+        <w:pStyle w:val="Zerrenda-paragrafoa"/>
+        <w:numPr>
+          <w:ilvl w:val="1"/>
+          <w:numId w:val="1"/>
+        </w:numPr>
+        <w:ind w:left="993"/>
+        <w:jc w:val="both"/>
+        <w:rPr>
+          <w:sz w:val="24"/>
+          <w:szCs w:val="24"/>
+        </w:rPr>
+      </w:pPr>
+      <w:r>
+        <w:rPr>
+          <w:sz w:val="24"/>
+          <w:szCs w:val="24"/>
+        </w:rPr>
+        <w:t xml:space="preserve">500 milioi salmentako Data </w:t>
+      </w:r>
+      <w:proofErr w:type="spellStart"/>
+      <w:r>
+        <w:rPr>
+          <w:sz w:val="24"/>
+          <w:szCs w:val="24"/>
+        </w:rPr>
+        <w:t>Lake</w:t>
+      </w:r>
+      <w:proofErr w:type="spellEnd"/>
+      <w:r>
+        <w:rPr>
+          <w:sz w:val="24"/>
+          <w:szCs w:val="24"/>
+        </w:rPr>
+        <w:t xml:space="preserve"> bat </w:t>
+      </w:r>
+      <w:proofErr w:type="spellStart"/>
+      <w:r>
+        <w:rPr>
+          <w:sz w:val="24"/>
+          <w:szCs w:val="24"/>
+        </w:rPr>
+        <w:t>Spark</w:t>
+      </w:r>
+      <w:proofErr w:type="spellEnd"/>
+      <w:r>
+        <w:rPr>
+          <w:sz w:val="24"/>
+          <w:szCs w:val="24"/>
+        </w:rPr>
+        <w:t>-ekin analizatu behar dugu.</w:t>
+      </w:r>
+    </w:p>
+    <w:p>
+      <w:pPr>
+        <w:pStyle w:val="Zerrenda-paragrafoa"/>
+        <w:numPr>
+          <w:ilvl w:val="1"/>
+          <w:numId w:val="1"/>
+        </w:numPr>
+        <w:ind w:left="993"/>
+        <w:jc w:val="both"/>
+        <w:rPr>
+          <w:sz w:val="24"/>
+          <w:szCs w:val="24"/>
+        </w:rPr>
+      </w:pPr>
+      <w:r>
+        <w:rPr>
+          <w:sz w:val="24"/>
+          <w:szCs w:val="24"/>
+        </w:rPr>
+        <w:t>Beste enpresa bati taula sinple bat bidali behar diogu, edozein tresnarekin ireki ahal izateko.</w:t>
+      </w:r>
+    </w:p>
+    <w:p>
+      <w:pPr>
+        <w:pStyle w:val="Zerrenda-paragrafoa"/>
+        <w:numPr>
+          <w:ilvl w:val="1"/>
+          <w:numId w:val="1"/>
+        </w:numPr>
+        <w:ind w:left="993"/>
+        <w:jc w:val="both"/>
+        <w:rPr>
+          <w:sz w:val="24"/>
+          <w:szCs w:val="24"/>
+        </w:rPr>
+      </w:pPr>
+      <w:r>
+        <w:rPr>
+          <w:sz w:val="24"/>
+          <w:szCs w:val="24"/>
+        </w:rPr>
+        <w:t xml:space="preserve">200 GB-ko </w:t>
+      </w:r>
+      <w:proofErr w:type="spellStart"/>
+      <w:r>
+        <w:rPr>
+          <w:sz w:val="24"/>
+          <w:szCs w:val="24"/>
+        </w:rPr>
+        <w:t>dataset</w:t>
+      </w:r>
+      <w:proofErr w:type="spellEnd"/>
+      <w:r>
+        <w:rPr>
+          <w:sz w:val="24"/>
+          <w:szCs w:val="24"/>
+        </w:rPr>
+        <w:t xml:space="preserve"> batean prezioa eta produktua zutabeak bakarrik analizatuko ditugu.</w:t>
+      </w:r>
+    </w:p>
+    <w:p>
+      <w:pPr>
+        <w:jc w:val="both"/>
+        <w:rPr>
+          <w:sz w:val="24"/>
+          <w:szCs w:val="24"/>
+        </w:rPr>
+      </w:pPr>
+    </w:p>
+    <w:p>
+      <w:pPr>
+        <w:pStyle w:val="Zerrenda-paragrafoa"/>
+        <w:numPr>
+          <w:ilvl w:val="0"/>
+          <w:numId w:val="1"/>
+        </w:numPr>
+        <w:ind w:left="426"/>
+        <w:jc w:val="both"/>
+        <w:rPr>
+          <w:b/>
+          <w:bCs/>
+          <w:sz w:val="24"/>
+          <w:szCs w:val="24"/>
+          <w:u w:val="single"/>
+        </w:rPr>
+      </w:pPr>
+      <w:proofErr w:type="spellStart"/>
+      <w:r>
+        <w:rPr>
+          <w:b/>
+          <w:bCs/>
+          <w:sz w:val="24"/>
+          <w:szCs w:val="24"/>
+          <w:u w:val="single"/>
+        </w:rPr>
+        <w:t>Errenkadaka</w:t>
+      </w:r>
+      <w:proofErr w:type="spellEnd"/>
+      <w:r>
+        <w:rPr>
+          <w:b/>
+          <w:bCs/>
+          <w:sz w:val="24"/>
+          <w:szCs w:val="24"/>
+          <w:u w:val="single"/>
+        </w:rPr>
+        <w:t xml:space="preserve"> ala </w:t>
+      </w:r>
+      <w:proofErr w:type="spellStart"/>
+      <w:r>
+        <w:rPr>
+          <w:b/>
+          <w:bCs/>
+          <w:sz w:val="24"/>
+          <w:szCs w:val="24"/>
+          <w:u w:val="single"/>
+        </w:rPr>
+        <w:t>zutabeka</w:t>
+      </w:r>
+      <w:proofErr w:type="spellEnd"/>
+      <w:r>
+        <w:rPr>
+          <w:b/>
+          <w:bCs/>
+          <w:sz w:val="24"/>
+          <w:szCs w:val="24"/>
+          <w:u w:val="single"/>
+        </w:rPr>
+        <w:t>?</w:t>
+      </w:r>
+    </w:p>
+    <w:p>
+      <w:pPr>
+        <w:ind w:left="426"/>
+        <w:jc w:val="both"/>
+        <w:rPr>
+          <w:sz w:val="24"/>
+          <w:szCs w:val="24"/>
+        </w:rPr>
+      </w:pPr>
+      <w:r>
+        <w:rPr>
+          <w:sz w:val="24"/>
+          <w:szCs w:val="24"/>
+        </w:rPr>
+        <w:t xml:space="preserve">Enpresa batek honako </w:t>
+      </w:r>
+      <w:proofErr w:type="spellStart"/>
+      <w:r>
+        <w:rPr>
+          <w:sz w:val="24"/>
+          <w:szCs w:val="24"/>
+        </w:rPr>
+        <w:t>dataset</w:t>
+      </w:r>
+      <w:proofErr w:type="spellEnd"/>
+      <w:r>
+        <w:rPr>
+          <w:sz w:val="24"/>
+          <w:szCs w:val="24"/>
+        </w:rPr>
+        <w:t>-a dauka:</w:t>
+      </w:r>
+    </w:p>
+    <w:p>
+      <w:pPr>
+        <w:ind w:left="426"/>
+        <w:jc w:val="both"/>
+        <w:rPr>
+          <w:b/>
+          <w:bCs/>
+          <w:sz w:val="24"/>
+          <w:szCs w:val="24"/>
+        </w:rPr>
+      </w:pPr>
+      <w:r>
+        <w:rPr>
+          <w:b/>
+          <w:bCs/>
+          <w:sz w:val="24"/>
+          <w:szCs w:val="24"/>
+        </w:rPr>
+        <w:t xml:space="preserve">id, data, produktua, kategoria, hiria, prezioa, unitateak, </w:t>
+      </w:r>
+      <w:proofErr w:type="spellStart"/>
+      <w:r>
+        <w:rPr>
+          <w:b/>
+          <w:bCs/>
+          <w:sz w:val="24"/>
+          <w:szCs w:val="24"/>
+        </w:rPr>
+        <w:t>bezero_id</w:t>
+      </w:r>
+      <w:proofErr w:type="spellEnd"/>
+    </w:p>
+    <w:p>
+      <w:pPr>
+        <w:ind w:left="426"/>
+        <w:jc w:val="both"/>
+        <w:rPr>
+          <w:sz w:val="24"/>
+          <w:szCs w:val="24"/>
+        </w:rPr>
+      </w:pPr>
+      <w:r>
+        <w:rPr>
+          <w:sz w:val="24"/>
+          <w:szCs w:val="24"/>
+        </w:rPr>
+        <w:t xml:space="preserve">Adierazi kasu bakoitzean </w:t>
+      </w:r>
+      <w:r>
+        <w:rPr>
+          <w:b/>
+          <w:bCs/>
+          <w:sz w:val="24"/>
+          <w:szCs w:val="24"/>
+        </w:rPr>
+        <w:t>errenkadetara orientatutako</w:t>
+      </w:r>
+      <w:r>
+        <w:rPr>
+          <w:sz w:val="24"/>
+          <w:szCs w:val="24"/>
+        </w:rPr>
+        <w:t xml:space="preserve"> edo </w:t>
+      </w:r>
+      <w:r>
+        <w:rPr>
+          <w:b/>
+          <w:bCs/>
+          <w:sz w:val="24"/>
+          <w:szCs w:val="24"/>
+        </w:rPr>
+        <w:t xml:space="preserve">zutabeetara orientatutako </w:t>
+      </w:r>
+      <w:r>
+        <w:rPr>
+          <w:sz w:val="24"/>
+          <w:szCs w:val="24"/>
+        </w:rPr>
+        <w:t>formatua interesgarriagoa den.</w:t>
+      </w:r>
+    </w:p>
+    <w:p>
+      <w:pPr>
+        <w:pStyle w:val="Zerrenda-paragrafoa"/>
+        <w:numPr>
+          <w:ilvl w:val="0"/>
+          <w:numId w:val="13"/>
+        </w:numPr>
+        <w:jc w:val="both"/>
+        <w:rPr>
+          <w:sz w:val="24"/>
+          <w:szCs w:val="24"/>
+        </w:rPr>
+      </w:pPr>
+      <w:proofErr w:type="spellStart"/>
+      <w:r>
+        <w:rPr>
+          <w:sz w:val="24"/>
+          <w:szCs w:val="24"/>
+        </w:rPr>
+        <w:t>bezero_id</w:t>
+      </w:r>
+      <w:proofErr w:type="spellEnd"/>
+      <w:r>
+        <w:rPr>
+          <w:sz w:val="24"/>
+          <w:szCs w:val="24"/>
+        </w:rPr>
+        <w:t>=4387 bezeroaren erosketa baten informazio osoa eskuratu.</w:t>
+      </w:r>
+    </w:p>
+    <w:p>
+      <w:pPr>
+        <w:pStyle w:val="Zerrenda-paragrafoa"/>
+        <w:numPr>
+          <w:ilvl w:val="0"/>
+          <w:numId w:val="13"/>
+        </w:numPr>
+        <w:jc w:val="both"/>
+        <w:rPr>
+          <w:sz w:val="24"/>
+          <w:szCs w:val="24"/>
+        </w:rPr>
+      </w:pPr>
+      <w:r>
+        <w:rPr>
+          <w:sz w:val="24"/>
+          <w:szCs w:val="24"/>
+        </w:rPr>
+        <w:t>Salmenta guztien batez besteko prezioa kalkulatu.</w:t>
+      </w:r>
+    </w:p>
+    <w:p>
+      <w:pPr>
+        <w:pStyle w:val="Zerrenda-paragrafoa"/>
+        <w:numPr>
+          <w:ilvl w:val="0"/>
+          <w:numId w:val="13"/>
+        </w:numPr>
+        <w:jc w:val="both"/>
+        <w:rPr>
+          <w:sz w:val="24"/>
+          <w:szCs w:val="24"/>
+        </w:rPr>
+      </w:pPr>
+      <w:r>
+        <w:rPr>
+          <w:sz w:val="24"/>
+          <w:szCs w:val="24"/>
+        </w:rPr>
+        <w:t>Produktu jakin baten erregistro osoa irakurri.</w:t>
+      </w:r>
+    </w:p>
+    <w:p>
+      <w:pPr>
+        <w:pStyle w:val="Zerrenda-paragrafoa"/>
+        <w:numPr>
+          <w:ilvl w:val="0"/>
+          <w:numId w:val="13"/>
+        </w:numPr>
+        <w:jc w:val="both"/>
+        <w:rPr>
+          <w:sz w:val="24"/>
+          <w:szCs w:val="24"/>
+        </w:rPr>
+      </w:pPr>
+      <w:r>
+        <w:rPr>
+          <w:sz w:val="24"/>
+          <w:szCs w:val="24"/>
+        </w:rPr>
+        <w:lastRenderedPageBreak/>
+        <w:t>Hiri bakoitzeko salmenta kopurua kalkulatu.</w:t>
+      </w:r>
+    </w:p>
+    <w:p>
+      <w:pPr>
+        <w:pStyle w:val="Zerrenda-paragrafoa"/>
+        <w:numPr>
+          <w:ilvl w:val="0"/>
+          <w:numId w:val="13"/>
+        </w:numPr>
+        <w:jc w:val="both"/>
+        <w:rPr>
+          <w:sz w:val="24"/>
+          <w:szCs w:val="24"/>
+        </w:rPr>
+      </w:pPr>
+      <w:r>
+        <w:rPr>
+          <w:sz w:val="24"/>
+          <w:szCs w:val="24"/>
+        </w:rPr>
+        <w:t>Milioika erregistrotatik hiria eta prezioa soilik analizatu.</w:t>
+      </w:r>
+    </w:p>
+    <w:p>
+      <w:pPr>
+        <w:jc w:val="both"/>
+        <w:rPr>
+          <w:sz w:val="24"/>
+          <w:szCs w:val="24"/>
+        </w:rPr>
+      </w:pPr>
+    </w:p>
+    <w:p>
+      <w:pPr>
+        <w:pStyle w:val="Zerrenda-paragrafoa"/>
+        <w:numPr>
+          <w:ilvl w:val="0"/>
+          <w:numId w:val="1"/>
+        </w:numPr>
+        <w:ind w:left="426"/>
+        <w:jc w:val="both"/>
+        <w:rPr>
+          <w:b/>
+          <w:bCs/>
+          <w:sz w:val="24"/>
+          <w:szCs w:val="24"/>
+          <w:u w:val="single"/>
+        </w:rPr>
+      </w:pPr>
+      <w:proofErr w:type="spellStart"/>
+      <w:r>
+        <w:rPr>
+          <w:b/>
+          <w:bCs/>
+          <w:sz w:val="24"/>
+          <w:szCs w:val="24"/>
+          <w:u w:val="single"/>
+        </w:rPr>
+        <w:t>Faker</w:t>
+      </w:r>
+      <w:proofErr w:type="spellEnd"/>
+      <w:r>
+        <w:rPr>
+          <w:b/>
+          <w:bCs/>
+          <w:sz w:val="24"/>
+          <w:szCs w:val="24"/>
+          <w:u w:val="single"/>
+        </w:rPr>
+        <w:t xml:space="preserve">-ekin lehen </w:t>
+      </w:r>
+      <w:proofErr w:type="spellStart"/>
+      <w:r>
+        <w:rPr>
+          <w:b/>
+          <w:bCs/>
+          <w:sz w:val="24"/>
+          <w:szCs w:val="24"/>
+          <w:u w:val="single"/>
+        </w:rPr>
+        <w:t>dataset</w:t>
+      </w:r>
+      <w:proofErr w:type="spellEnd"/>
+      <w:r>
+        <w:rPr>
+          <w:b/>
+          <w:bCs/>
+          <w:sz w:val="24"/>
+          <w:szCs w:val="24"/>
+          <w:u w:val="single"/>
+        </w:rPr>
+        <w:t>-a</w:t>
+      </w:r>
+    </w:p>
+    <w:p>
+      <w:pPr>
+        <w:ind w:left="426"/>
+        <w:jc w:val="both"/>
+        <w:rPr>
+          <w:sz w:val="24"/>
+          <w:szCs w:val="24"/>
+        </w:rPr>
+      </w:pPr>
+      <w:r>
+        <w:rPr>
+          <w:sz w:val="24"/>
+          <w:szCs w:val="24"/>
+        </w:rPr>
+        <w:t>Sortu bezeroak.csv fitxategia 100 bezero sintetikorekin.</w:t>
+      </w:r>
+    </w:p>
+    <w:p>
+      <w:pPr>
+        <w:spacing w:after="40"/>
+        <w:ind w:left="425"/>
+        <w:jc w:val="both"/>
+        <w:rPr>
+          <w:sz w:val="24"/>
+          <w:szCs w:val="24"/>
+        </w:rPr>
+      </w:pPr>
+      <w:r>
+        <w:rPr>
+          <w:sz w:val="24"/>
+          <w:szCs w:val="24"/>
+        </w:rPr>
+        <w:t>Gutxienez:</w:t>
+      </w:r>
+    </w:p>
+    <w:p>
+      <w:pPr>
+        <w:pStyle w:val="Zerrenda-paragrafoa"/>
+        <w:numPr>
+          <w:ilvl w:val="0"/>
+          <w:numId w:val="15"/>
+        </w:numPr>
+        <w:spacing w:after="0"/>
+        <w:ind w:left="1145" w:hanging="357"/>
+        <w:jc w:val="both"/>
+        <w:rPr>
+          <w:sz w:val="24"/>
+          <w:szCs w:val="24"/>
+        </w:rPr>
+      </w:pPr>
+      <w:r>
+        <w:rPr>
+          <w:sz w:val="24"/>
+          <w:szCs w:val="24"/>
+        </w:rPr>
+        <w:t>id</w:t>
+      </w:r>
+    </w:p>
+    <w:p>
+      <w:pPr>
+        <w:pStyle w:val="Zerrenda-paragrafoa"/>
+        <w:numPr>
+          <w:ilvl w:val="0"/>
+          <w:numId w:val="15"/>
+        </w:numPr>
+        <w:spacing w:after="0"/>
+        <w:ind w:left="1145" w:hanging="357"/>
+        <w:jc w:val="both"/>
+        <w:rPr>
+          <w:sz w:val="24"/>
+          <w:szCs w:val="24"/>
+        </w:rPr>
+      </w:pPr>
+      <w:r>
+        <w:rPr>
+          <w:sz w:val="24"/>
+          <w:szCs w:val="24"/>
+        </w:rPr>
+        <w:t>izena</w:t>
+      </w:r>
+    </w:p>
+    <w:p>
+      <w:pPr>
+        <w:pStyle w:val="Zerrenda-paragrafoa"/>
+        <w:numPr>
+          <w:ilvl w:val="0"/>
+          <w:numId w:val="15"/>
+        </w:numPr>
+        <w:spacing w:after="0"/>
+        <w:ind w:left="1145" w:hanging="357"/>
+        <w:jc w:val="both"/>
+        <w:rPr>
+          <w:sz w:val="24"/>
+          <w:szCs w:val="24"/>
+        </w:rPr>
+      </w:pPr>
+      <w:r>
+        <w:rPr>
+          <w:sz w:val="24"/>
+          <w:szCs w:val="24"/>
+        </w:rPr>
+        <w:t>emaila</w:t>
+      </w:r>
+    </w:p>
+    <w:p>
+      <w:pPr>
+        <w:pStyle w:val="Zerrenda-paragrafoa"/>
+        <w:numPr>
+          <w:ilvl w:val="0"/>
+          <w:numId w:val="15"/>
+        </w:numPr>
+        <w:spacing w:after="0"/>
+        <w:ind w:left="1145" w:hanging="357"/>
+        <w:jc w:val="both"/>
+        <w:rPr>
+          <w:sz w:val="24"/>
+          <w:szCs w:val="24"/>
+        </w:rPr>
+      </w:pPr>
+      <w:r>
+        <w:rPr>
+          <w:sz w:val="24"/>
+          <w:szCs w:val="24"/>
+        </w:rPr>
+        <w:t>hiria</w:t>
+      </w:r>
+    </w:p>
+    <w:p>
+      <w:pPr>
+        <w:pStyle w:val="Zerrenda-paragrafoa"/>
+        <w:numPr>
+          <w:ilvl w:val="0"/>
+          <w:numId w:val="15"/>
+        </w:numPr>
+        <w:jc w:val="both"/>
+        <w:rPr>
+          <w:sz w:val="24"/>
+          <w:szCs w:val="24"/>
+        </w:rPr>
+      </w:pPr>
+      <w:r>
+        <w:rPr>
+          <w:sz w:val="24"/>
+          <w:szCs w:val="24"/>
+        </w:rPr>
+        <w:t>adina</w:t>
+      </w:r>
+    </w:p>
+    <w:p>
+      <w:pPr>
+        <w:ind w:left="426"/>
+        <w:jc w:val="both"/>
+        <w:rPr>
+          <w:sz w:val="24"/>
+          <w:szCs w:val="24"/>
+        </w:rPr>
+      </w:pPr>
+      <w:r>
+        <w:rPr>
+          <w:sz w:val="24"/>
+          <w:szCs w:val="24"/>
+        </w:rPr>
+        <w:t>Baldintzak:</w:t>
+      </w:r>
+    </w:p>
+    <w:p>
+      <w:pPr>
+        <w:pStyle w:val="Zerrenda-paragrafoa"/>
+        <w:numPr>
+          <w:ilvl w:val="0"/>
+          <w:numId w:val="16"/>
+        </w:numPr>
+        <w:ind w:left="1134"/>
+        <w:jc w:val="both"/>
+        <w:rPr>
+          <w:sz w:val="24"/>
+          <w:szCs w:val="24"/>
+        </w:rPr>
+      </w:pPr>
+      <w:proofErr w:type="spellStart"/>
+      <w:r>
+        <w:rPr>
+          <w:sz w:val="24"/>
+          <w:szCs w:val="24"/>
+        </w:rPr>
+        <w:t>Faker</w:t>
+      </w:r>
+      <w:proofErr w:type="spellEnd"/>
+      <w:r>
+        <w:rPr>
+          <w:sz w:val="24"/>
+          <w:szCs w:val="24"/>
+        </w:rPr>
+        <w:t>(‘</w:t>
+      </w:r>
+      <w:proofErr w:type="spellStart"/>
+      <w:r>
+        <w:rPr>
+          <w:sz w:val="24"/>
+          <w:szCs w:val="24"/>
+        </w:rPr>
+        <w:t>es_ES</w:t>
+      </w:r>
+      <w:proofErr w:type="spellEnd"/>
+      <w:r>
+        <w:rPr>
+          <w:sz w:val="24"/>
+          <w:szCs w:val="24"/>
+        </w:rPr>
+        <w:t>’) erabili.</w:t>
+      </w:r>
+    </w:p>
+    <w:p>
+      <w:pPr>
+        <w:pStyle w:val="Zerrenda-paragrafoa"/>
+        <w:numPr>
+          <w:ilvl w:val="0"/>
+          <w:numId w:val="16"/>
+        </w:numPr>
+        <w:ind w:left="1134"/>
+        <w:jc w:val="both"/>
+        <w:rPr>
+          <w:sz w:val="24"/>
+          <w:szCs w:val="24"/>
+        </w:rPr>
+      </w:pPr>
+      <w:r>
+        <w:rPr>
+          <w:sz w:val="24"/>
+          <w:szCs w:val="24"/>
+        </w:rPr>
+        <w:t>Adina 18-80 artean.</w:t>
+      </w:r>
+    </w:p>
+    <w:p>
+      <w:pPr>
+        <w:pStyle w:val="Zerrenda-paragrafoa"/>
+        <w:numPr>
+          <w:ilvl w:val="0"/>
+          <w:numId w:val="16"/>
+        </w:numPr>
+        <w:ind w:left="1134"/>
+        <w:jc w:val="both"/>
+        <w:rPr>
+          <w:sz w:val="24"/>
+          <w:szCs w:val="24"/>
+        </w:rPr>
+      </w:pPr>
+      <w:r>
+        <w:rPr>
+          <w:sz w:val="24"/>
+          <w:szCs w:val="24"/>
+        </w:rPr>
+        <w:t>Goiburua izan behar du.</w:t>
+      </w:r>
+    </w:p>
+    <w:p>
+      <w:pPr>
+        <w:pStyle w:val="Zerrenda-paragrafoa"/>
+        <w:numPr>
+          <w:ilvl w:val="0"/>
+          <w:numId w:val="16"/>
+        </w:numPr>
+        <w:ind w:left="1134"/>
+        <w:jc w:val="both"/>
+        <w:rPr>
+          <w:sz w:val="24"/>
+          <w:szCs w:val="24"/>
+        </w:rPr>
+      </w:pPr>
+      <w:r>
+        <w:rPr>
+          <w:sz w:val="24"/>
+          <w:szCs w:val="24"/>
+        </w:rPr>
+        <w:t>100 erregistro izan behar ditu.</w:t>
+      </w:r>
+    </w:p>
+    <w:p>
+      <w:pPr>
+        <w:pStyle w:val="Zerrenda-paragrafoa"/>
+        <w:numPr>
+          <w:ilvl w:val="0"/>
+          <w:numId w:val="16"/>
+        </w:numPr>
+        <w:ind w:left="1134"/>
+        <w:jc w:val="both"/>
+        <w:rPr>
+          <w:sz w:val="24"/>
+          <w:szCs w:val="24"/>
+        </w:rPr>
+      </w:pPr>
+      <w:r>
+        <w:rPr>
+          <w:sz w:val="24"/>
+          <w:szCs w:val="24"/>
+        </w:rPr>
+        <w:t>Fitxategia ireki eta emaitza egiaztatu.</w:t>
+      </w:r>
+    </w:p>
+    <w:p>
+      <w:pPr>
+        <w:ind w:left="426"/>
+        <w:jc w:val="both"/>
+        <w:rPr>
+          <w:sz w:val="24"/>
+          <w:szCs w:val="24"/>
+        </w:rPr>
+      </w:pPr>
+      <w:r>
+        <w:rPr>
+          <w:sz w:val="24"/>
+          <w:szCs w:val="24"/>
+        </w:rPr>
+        <w:t xml:space="preserve">Ondoren, aldatu kodea </w:t>
+      </w:r>
+      <w:r>
+        <w:rPr>
+          <w:b/>
+          <w:bCs/>
+          <w:sz w:val="24"/>
+          <w:szCs w:val="24"/>
+        </w:rPr>
+        <w:t>10.000 bezero</w:t>
+      </w:r>
+      <w:r>
+        <w:rPr>
+          <w:sz w:val="24"/>
+          <w:szCs w:val="24"/>
+        </w:rPr>
+        <w:t xml:space="preserve"> sortzeko.</w:t>
+      </w:r>
+    </w:p>
+    <w:p>
+      <w:pPr>
+        <w:ind w:left="426"/>
+        <w:jc w:val="both"/>
+        <w:rPr>
+          <w:sz w:val="24"/>
+          <w:szCs w:val="24"/>
+        </w:rPr>
+      </w:pPr>
+      <w:r>
+        <w:rPr>
+          <w:sz w:val="24"/>
+          <w:szCs w:val="24"/>
+        </w:rPr>
+        <w:t>Zer aldatu behar duzu 100 erregistrotik 10.000ra pasatzeko?</w:t>
+      </w:r>
+    </w:p>
+    <w:p>
+      <w:pPr>
+        <w:ind w:left="426"/>
+        <w:jc w:val="both"/>
+        <w:rPr>
+          <w:sz w:val="24"/>
+          <w:szCs w:val="24"/>
+        </w:rPr>
+      </w:pPr>
+    </w:p>
+    <w:p>
+      <w:pPr>
+        <w:pStyle w:val="Zerrenda-paragrafoa"/>
+        <w:numPr>
+          <w:ilvl w:val="0"/>
+          <w:numId w:val="1"/>
+        </w:numPr>
+        <w:ind w:left="426"/>
+        <w:jc w:val="both"/>
+        <w:rPr>
+          <w:b/>
+          <w:bCs/>
+          <w:sz w:val="24"/>
+          <w:szCs w:val="24"/>
+          <w:u w:val="single"/>
+        </w:rPr>
+      </w:pPr>
+      <w:r>
+        <w:rPr>
+          <w:b/>
+          <w:bCs/>
+          <w:sz w:val="24"/>
+          <w:szCs w:val="24"/>
+          <w:u w:val="single"/>
+        </w:rPr>
+        <w:t xml:space="preserve">Zer egiten du </w:t>
+      </w:r>
+      <w:proofErr w:type="spellStart"/>
+      <w:r>
+        <w:rPr>
+          <w:b/>
+          <w:bCs/>
+          <w:sz w:val="24"/>
+          <w:szCs w:val="24"/>
+          <w:u w:val="single"/>
+        </w:rPr>
+        <w:t>seed-ak</w:t>
+      </w:r>
+      <w:proofErr w:type="spellEnd"/>
+      <w:r>
+        <w:rPr>
+          <w:b/>
+          <w:bCs/>
+          <w:sz w:val="24"/>
+          <w:szCs w:val="24"/>
+          <w:u w:val="single"/>
+        </w:rPr>
+        <w:t>?</w:t>
+      </w:r>
+    </w:p>
+    <w:p>
+      <w:pPr>
+        <w:ind w:left="426"/>
+        <w:jc w:val="both"/>
+        <w:rPr>
+          <w:sz w:val="24"/>
+          <w:szCs w:val="24"/>
+        </w:rPr>
+      </w:pPr>
+      <w:proofErr w:type="spellStart"/>
+      <w:r>
+        <w:rPr>
+          <w:sz w:val="24"/>
+          <w:szCs w:val="24"/>
+        </w:rPr>
+        <w:t>Faker-ek</w:t>
+      </w:r>
+      <w:proofErr w:type="spellEnd"/>
+      <w:r>
+        <w:rPr>
+          <w:sz w:val="24"/>
+          <w:szCs w:val="24"/>
+        </w:rPr>
+        <w:t xml:space="preserve"> normalean datu desberdinak sortzen ditu programa exekutatzen dugun bakoitzean. Ariketa honetan </w:t>
+      </w:r>
+      <w:proofErr w:type="spellStart"/>
+      <w:r>
+        <w:rPr>
+          <w:sz w:val="24"/>
+          <w:szCs w:val="24"/>
+        </w:rPr>
+        <w:t>seed</w:t>
+      </w:r>
+      <w:proofErr w:type="spellEnd"/>
+      <w:r>
+        <w:rPr>
+          <w:sz w:val="24"/>
+          <w:szCs w:val="24"/>
+        </w:rPr>
+        <w:t xml:space="preserve"> erabiltzeak zer eragin duen egiaztatuko dugu.</w:t>
+      </w:r>
+    </w:p>
+    <w:p>
+      <w:pPr>
+        <w:spacing w:after="40"/>
+        <w:ind w:left="425"/>
+        <w:jc w:val="both"/>
+        <w:rPr>
+          <w:b/>
+          <w:bCs/>
+          <w:sz w:val="24"/>
+          <w:szCs w:val="24"/>
+        </w:rPr>
+      </w:pPr>
+      <w:r>
+        <w:rPr>
+          <w:b/>
+          <w:bCs/>
+          <w:sz w:val="24"/>
+          <w:szCs w:val="24"/>
+          <w:u w:val="single"/>
+        </w:rPr>
+        <w:t>A kasua</w:t>
+      </w:r>
+      <w:r>
+        <w:rPr>
+          <w:b/>
+          <w:bCs/>
+          <w:sz w:val="24"/>
+          <w:szCs w:val="24"/>
+        </w:rPr>
+        <w:t xml:space="preserve">: </w:t>
+      </w:r>
+      <w:proofErr w:type="spellStart"/>
+      <w:r>
+        <w:rPr>
+          <w:b/>
+          <w:bCs/>
+          <w:sz w:val="24"/>
+          <w:szCs w:val="24"/>
+        </w:rPr>
+        <w:t>Seed</w:t>
+      </w:r>
+      <w:proofErr w:type="spellEnd"/>
+      <w:r>
+        <w:rPr>
+          <w:b/>
+          <w:bCs/>
+          <w:sz w:val="24"/>
+          <w:szCs w:val="24"/>
+        </w:rPr>
+        <w:t xml:space="preserve"> gabe</w:t>
+      </w:r>
+    </w:p>
+    <w:p>
+      <w:pPr>
+        <w:spacing w:after="40"/>
+        <w:ind w:left="425"/>
+        <w:jc w:val="both"/>
+        <w:rPr>
+          <w:sz w:val="24"/>
+          <w:szCs w:val="24"/>
+        </w:rPr>
+      </w:pPr>
+      <w:r>
+        <w:rPr>
+          <w:sz w:val="24"/>
+          <w:szCs w:val="24"/>
+        </w:rPr>
+        <w:t>Exekutatu bi aldiz aurreko programa.</w:t>
+      </w:r>
+    </w:p>
+    <w:p>
+      <w:pPr>
+        <w:shd w:val="clear" w:color="auto" w:fill="F2F2F2" w:themeFill="background1" w:themeFillShade="F2"/>
+        <w:spacing w:after="40"/>
+        <w:ind w:left="851"/>
+        <w:jc w:val="both"/>
+        <w:rPr>
+          <w:b/>
+          <w:bCs/>
+          <w:sz w:val="24"/>
+          <w:szCs w:val="24"/>
+        </w:rPr>
+      </w:pPr>
+      <w:r>
+        <w:rPr>
+          <w:b/>
+          <w:bCs/>
+          <w:sz w:val="24"/>
+          <w:szCs w:val="24"/>
+        </w:rPr>
+        <w:t xml:space="preserve">fake = </w:t>
+      </w:r>
+      <w:proofErr w:type="spellStart"/>
+      <w:r>
+        <w:rPr>
+          <w:b/>
+          <w:bCs/>
+          <w:sz w:val="24"/>
+          <w:szCs w:val="24"/>
+        </w:rPr>
+        <w:t>Faker</w:t>
+      </w:r>
+      <w:proofErr w:type="spellEnd"/>
+      <w:r>
+        <w:rPr>
+          <w:b/>
+          <w:bCs/>
+          <w:sz w:val="24"/>
+          <w:szCs w:val="24"/>
+        </w:rPr>
+        <w:t>('</w:t>
+      </w:r>
+      <w:proofErr w:type="spellStart"/>
+      <w:r>
+        <w:rPr>
+          <w:b/>
+          <w:bCs/>
+          <w:sz w:val="24"/>
+          <w:szCs w:val="24"/>
+        </w:rPr>
+        <w:t>es_ES</w:t>
+      </w:r>
+      <w:proofErr w:type="spellEnd"/>
+      <w:r>
+        <w:rPr>
+          <w:b/>
+          <w:bCs/>
+          <w:sz w:val="24"/>
+          <w:szCs w:val="24"/>
+        </w:rPr>
+        <w:t>')</w:t>
+      </w:r>
+    </w:p>
+    <w:p>
+      <w:pPr>
+        <w:spacing w:after="40"/>
+        <w:ind w:left="851"/>
+        <w:jc w:val="both"/>
+        <w:rPr>
+          <w:sz w:val="24"/>
+          <w:szCs w:val="24"/>
+        </w:rPr>
+      </w:pPr>
+    </w:p>
+    <w:p>
+      <w:pPr>
+        <w:spacing w:after="40"/>
+        <w:ind w:left="425"/>
+        <w:jc w:val="both"/>
+        <w:rPr>
+          <w:sz w:val="24"/>
+          <w:szCs w:val="24"/>
+        </w:rPr>
+      </w:pPr>
+      <w:r>
+        <w:rPr>
+          <w:sz w:val="24"/>
+          <w:szCs w:val="24"/>
+        </w:rPr>
+        <w:t>Bi exekuzioetako lehenengo bost pertsonak alderatu.</w:t>
+      </w:r>
+    </w:p>
+    <w:p>
+      <w:pPr>
+        <w:spacing w:after="40"/>
+        <w:ind w:left="425"/>
+        <w:jc w:val="both"/>
+        <w:rPr>
+          <w:sz w:val="24"/>
+          <w:szCs w:val="24"/>
+        </w:rPr>
+      </w:pPr>
+    </w:p>
+    <w:p>
+      <w:pPr>
+        <w:spacing w:after="40"/>
+        <w:ind w:left="425"/>
+        <w:jc w:val="both"/>
+        <w:rPr>
+          <w:b/>
+          <w:bCs/>
+          <w:sz w:val="24"/>
+          <w:szCs w:val="24"/>
+        </w:rPr>
+      </w:pPr>
+      <w:r>
+        <w:rPr>
+          <w:b/>
+          <w:bCs/>
+          <w:sz w:val="24"/>
+          <w:szCs w:val="24"/>
+          <w:u w:val="single"/>
+        </w:rPr>
+        <w:t>B kasua</w:t>
+      </w:r>
+      <w:r>
+        <w:rPr>
+          <w:b/>
+          <w:bCs/>
+          <w:sz w:val="24"/>
+          <w:szCs w:val="24"/>
+        </w:rPr>
+        <w:t xml:space="preserve">: </w:t>
+      </w:r>
+      <w:proofErr w:type="spellStart"/>
+      <w:r>
+        <w:rPr>
+          <w:b/>
+          <w:bCs/>
+          <w:sz w:val="24"/>
+          <w:szCs w:val="24"/>
+        </w:rPr>
+        <w:t>Seed</w:t>
+      </w:r>
+      <w:proofErr w:type="spellEnd"/>
+      <w:r>
+        <w:rPr>
+          <w:b/>
+          <w:bCs/>
+          <w:sz w:val="24"/>
+          <w:szCs w:val="24"/>
+        </w:rPr>
+        <w:t>-ekin</w:t>
+      </w:r>
+    </w:p>
+    <w:p>
+      <w:pPr>
+        <w:shd w:val="clear" w:color="auto" w:fill="F2F2F2" w:themeFill="background1" w:themeFillShade="F2"/>
+        <w:spacing w:after="40"/>
+        <w:ind w:left="851"/>
+        <w:jc w:val="both"/>
+        <w:rPr>
+          <w:b/>
+          <w:bCs/>
+          <w:sz w:val="24"/>
+          <w:szCs w:val="24"/>
+        </w:rPr>
+      </w:pPr>
+      <w:proofErr w:type="spellStart"/>
+      <w:r>
+        <w:rPr>
+          <w:b/>
+          <w:bCs/>
+          <w:sz w:val="24"/>
+          <w:szCs w:val="24"/>
+        </w:rPr>
+        <w:t>Faker.seed</w:t>
+      </w:r>
+      <w:proofErr w:type="spellEnd"/>
+      <w:r>
+        <w:rPr>
+          <w:b/>
+          <w:bCs/>
+          <w:sz w:val="24"/>
+          <w:szCs w:val="24"/>
+        </w:rPr>
+        <w:t>(42)</w:t>
+      </w:r>
+    </w:p>
+    <w:p>
+      <w:pPr>
+        <w:shd w:val="clear" w:color="auto" w:fill="F2F2F2" w:themeFill="background1" w:themeFillShade="F2"/>
+        <w:spacing w:after="40"/>
+        <w:ind w:left="851"/>
+        <w:jc w:val="both"/>
+        <w:rPr>
+          <w:b/>
+          <w:bCs/>
+          <w:sz w:val="24"/>
+          <w:szCs w:val="24"/>
+        </w:rPr>
+      </w:pPr>
+      <w:r>
+        <w:rPr>
+          <w:b/>
+          <w:bCs/>
+          <w:sz w:val="24"/>
+          <w:szCs w:val="24"/>
+        </w:rPr>
+        <w:t xml:space="preserve">fake = </w:t>
+      </w:r>
+      <w:proofErr w:type="spellStart"/>
+      <w:r>
+        <w:rPr>
+          <w:b/>
+          <w:bCs/>
+          <w:sz w:val="24"/>
+          <w:szCs w:val="24"/>
+        </w:rPr>
+        <w:t>Faker</w:t>
+      </w:r>
+      <w:proofErr w:type="spellEnd"/>
+      <w:r>
+        <w:rPr>
+          <w:b/>
+          <w:bCs/>
+          <w:sz w:val="24"/>
+          <w:szCs w:val="24"/>
+        </w:rPr>
+        <w:t>('</w:t>
+      </w:r>
+      <w:proofErr w:type="spellStart"/>
+      <w:r>
+        <w:rPr>
+          <w:b/>
+          <w:bCs/>
+          <w:sz w:val="24"/>
+          <w:szCs w:val="24"/>
+        </w:rPr>
+        <w:t>es_ES</w:t>
+      </w:r>
+      <w:proofErr w:type="spellEnd"/>
+      <w:r>
+        <w:rPr>
+          <w:b/>
+          <w:bCs/>
+          <w:sz w:val="24"/>
+          <w:szCs w:val="24"/>
+        </w:rPr>
+        <w:t>')</w:t>
+      </w:r>
+    </w:p>
+    <w:p>
+      <w:pPr>
+        <w:spacing w:after="40"/>
+        <w:ind w:left="425"/>
+        <w:jc w:val="both"/>
+        <w:rPr>
+          <w:sz w:val="24"/>
+          <w:szCs w:val="24"/>
+        </w:rPr>
+      </w:pPr>
+      <w:r>
+        <w:rPr>
+          <w:sz w:val="24"/>
+          <w:szCs w:val="24"/>
+        </w:rPr>
+        <w:t>Berriro bi aldiz exekutatu.</w:t>
+      </w:r>
+    </w:p>
+    <w:p>
+      <w:pPr>
+        <w:spacing w:after="40"/>
+        <w:ind w:left="425"/>
+        <w:jc w:val="both"/>
+        <w:rPr>
+          <w:sz w:val="24"/>
+          <w:szCs w:val="24"/>
+        </w:rPr>
+      </w:pPr>
+    </w:p>
+    <w:p>
+      <w:pPr>
+        <w:spacing w:after="40"/>
+        <w:ind w:left="425"/>
+        <w:jc w:val="both"/>
+        <w:rPr>
+          <w:sz w:val="24"/>
+          <w:szCs w:val="24"/>
+        </w:rPr>
+      </w:pPr>
+      <w:r>
+        <w:rPr>
+          <w:sz w:val="24"/>
+          <w:szCs w:val="24"/>
+        </w:rPr>
+        <w:t>Erantzun:</w:t>
+      </w:r>
+    </w:p>
+    <w:p>
+      <w:pPr>
+        <w:pStyle w:val="Zerrenda-paragrafoa"/>
+        <w:numPr>
+          <w:ilvl w:val="0"/>
+          <w:numId w:val="17"/>
+        </w:numPr>
+        <w:spacing w:after="40"/>
+        <w:jc w:val="both"/>
+        <w:rPr>
+          <w:sz w:val="24"/>
+          <w:szCs w:val="24"/>
+        </w:rPr>
+      </w:pPr>
+      <w:r>
+        <w:rPr>
+          <w:sz w:val="24"/>
+          <w:szCs w:val="24"/>
+        </w:rPr>
+        <w:lastRenderedPageBreak/>
+        <w:t xml:space="preserve">Zer </w:t>
+      </w:r>
+      <w:r>
+        <w:rPr>
+          <w:sz w:val="24"/>
+          <w:szCs w:val="24"/>
+        </w:rPr>
+        <w:t>gertatu da lehenengo kasuan?</w:t>
+      </w:r>
+    </w:p>
+    <w:p>
+      <w:pPr>
+        <w:pStyle w:val="Zerrenda-paragrafoa"/>
+        <w:numPr>
+          <w:ilvl w:val="0"/>
+          <w:numId w:val="17"/>
+        </w:numPr>
+        <w:spacing w:after="40"/>
+        <w:jc w:val="both"/>
+        <w:rPr>
+          <w:sz w:val="24"/>
+          <w:szCs w:val="24"/>
+        </w:rPr>
+      </w:pPr>
+      <w:r>
+        <w:rPr>
+          <w:sz w:val="24"/>
+          <w:szCs w:val="24"/>
+        </w:rPr>
+        <w:t>Zer gertatu da bigarrenean?</w:t>
+      </w:r>
+    </w:p>
+    <w:p>
+      <w:pPr>
+        <w:pStyle w:val="Zerrenda-paragrafoa"/>
+        <w:numPr>
+          <w:ilvl w:val="0"/>
+          <w:numId w:val="17"/>
+        </w:numPr>
+        <w:spacing w:after="40"/>
+        <w:jc w:val="both"/>
+        <w:rPr>
+          <w:sz w:val="24"/>
+          <w:szCs w:val="24"/>
+        </w:rPr>
+      </w:pPr>
+      <w:r>
+        <w:rPr>
+          <w:sz w:val="24"/>
+          <w:szCs w:val="24"/>
+        </w:rPr>
+        <w:t xml:space="preserve">Zertarako izan daiteke erabilgarria </w:t>
+      </w:r>
+      <w:proofErr w:type="spellStart"/>
+      <w:r>
+        <w:rPr>
+          <w:sz w:val="24"/>
+          <w:szCs w:val="24"/>
+        </w:rPr>
+        <w:t>seed</w:t>
+      </w:r>
+      <w:proofErr w:type="spellEnd"/>
+      <w:r>
+        <w:rPr>
+          <w:sz w:val="24"/>
+          <w:szCs w:val="24"/>
+        </w:rPr>
+        <w:t xml:space="preserve"> bat test automatizatuetan?</w:t>
+      </w:r>
+    </w:p>
+    <w:p>
+      <w:pPr>
+        <w:pStyle w:val="Zerrenda-paragrafoa"/>
+        <w:numPr>
+          <w:ilvl w:val="0"/>
+          <w:numId w:val="17"/>
+        </w:numPr>
+        <w:spacing w:after="40"/>
+        <w:jc w:val="both"/>
+        <w:rPr>
+          <w:sz w:val="24"/>
+          <w:szCs w:val="24"/>
+        </w:rPr>
+      </w:pPr>
+      <w:r>
+        <w:rPr>
+          <w:sz w:val="24"/>
+          <w:szCs w:val="24"/>
+        </w:rPr>
+        <w:t xml:space="preserve">Irakasleak eta ikasle guztiek </w:t>
+      </w:r>
+      <w:proofErr w:type="spellStart"/>
+      <w:r>
+        <w:rPr>
+          <w:sz w:val="24"/>
+          <w:szCs w:val="24"/>
+        </w:rPr>
+        <w:t>seed</w:t>
+      </w:r>
+      <w:proofErr w:type="spellEnd"/>
+      <w:r>
+        <w:rPr>
+          <w:sz w:val="24"/>
+          <w:szCs w:val="24"/>
+        </w:rPr>
+        <w:t>=42 erabiltzen badute, zer abantaila dauka?</w:t>
+      </w:r>
+    </w:p>
+    <w:p>
+      <w:pPr>
+        <w:spacing w:after="40"/>
+        <w:ind w:left="425"/>
+        <w:jc w:val="both"/>
+        <w:rPr>
+          <w:b/>
+          <w:bCs/>
+          <w:sz w:val="24"/>
+          <w:szCs w:val="24"/>
+        </w:rPr>
+      </w:pPr>
+    </w:p>
+    <w:p>
+      <w:pPr>
+        <w:pStyle w:val="Zerrenda-paragrafoa"/>
+        <w:numPr>
+          <w:ilvl w:val="0"/>
+          <w:numId w:val="1"/>
+        </w:numPr>
+        <w:ind w:left="426"/>
+        <w:jc w:val="both"/>
+        <w:rPr>
+          <w:b/>
+          <w:bCs/>
+          <w:sz w:val="24"/>
+          <w:szCs w:val="24"/>
+          <w:u w:val="single"/>
+        </w:rPr>
+      </w:pPr>
+      <w:r>
+        <w:rPr>
+          <w:b/>
+          <w:bCs/>
+          <w:sz w:val="24"/>
+          <w:szCs w:val="24"/>
+          <w:u w:val="single"/>
+        </w:rPr>
+        <w:t xml:space="preserve">CSV </w:t>
+      </w:r>
+      <w:r>
+        <w:rPr>
+          <w:b/>
+          <w:bCs/>
+          <w:sz w:val="24"/>
+          <w:szCs w:val="24"/>
+          <w:u w:val="single"/>
+        </w:rPr>
+        <w:sym w:font="Wingdings" w:char="F0E0"/>
+      </w:r>
+      <w:r>
+        <w:rPr>
+          <w:b/>
+          <w:bCs/>
+          <w:sz w:val="24"/>
+          <w:szCs w:val="24"/>
+          <w:u w:val="single"/>
+        </w:rPr>
+        <w:t xml:space="preserve"> JSON</w:t>
+      </w:r>
+    </w:p>
+    <w:p>
+      <w:pPr>
+        <w:spacing w:after="40"/>
+        <w:ind w:left="425"/>
+        <w:jc w:val="both"/>
+        <w:rPr>
+          <w:sz w:val="24"/>
+          <w:szCs w:val="24"/>
+        </w:rPr>
+      </w:pPr>
+      <w:r>
+        <w:rPr>
+          <w:sz w:val="24"/>
+          <w:szCs w:val="24"/>
+        </w:rPr>
+        <w:t xml:space="preserve">Aurreko </w:t>
+      </w:r>
+      <w:r>
+        <w:rPr>
+          <w:b/>
+          <w:bCs/>
+          <w:sz w:val="24"/>
+          <w:szCs w:val="24"/>
+        </w:rPr>
+        <w:t>bezeroak.csv</w:t>
+      </w:r>
+      <w:r>
+        <w:rPr>
+          <w:sz w:val="24"/>
+          <w:szCs w:val="24"/>
+        </w:rPr>
+        <w:t xml:space="preserve"> hartu eta </w:t>
+      </w:r>
+      <w:proofErr w:type="spellStart"/>
+      <w:r>
+        <w:rPr>
+          <w:b/>
+          <w:bCs/>
+          <w:sz w:val="24"/>
+          <w:szCs w:val="24"/>
+        </w:rPr>
+        <w:t>bezeroak.json</w:t>
+      </w:r>
+      <w:proofErr w:type="spellEnd"/>
+      <w:r>
+        <w:rPr>
+          <w:sz w:val="24"/>
+          <w:szCs w:val="24"/>
+        </w:rPr>
+        <w:t xml:space="preserve"> sortu.</w:t>
+      </w:r>
+    </w:p>
+    <w:p>
+      <w:pPr>
+        <w:spacing w:after="40"/>
+        <w:ind w:left="425"/>
+        <w:jc w:val="both"/>
+        <w:rPr>
+          <w:sz w:val="24"/>
+          <w:szCs w:val="24"/>
+        </w:rPr>
+      </w:pPr>
+      <w:r>
+        <w:rPr>
+          <w:sz w:val="24"/>
+          <w:szCs w:val="24"/>
+        </w:rPr>
+        <w:t>Egitura:</w:t>
+      </w:r>
+    </w:p>
+    <w:p>
+      <w:pPr>
+        <w:shd w:val="clear" w:color="auto" w:fill="F2F2F2" w:themeFill="background1" w:themeFillShade="F2"/>
+        <w:spacing w:after="0" w:line="240" w:lineRule="auto"/>
+        <w:ind w:left="425"/>
+        <w:jc w:val="both"/>
+        <w:rPr>
+          <w:sz w:val="24"/>
+          <w:szCs w:val="24"/>
+        </w:rPr>
+      </w:pPr>
+      <w:r>
+        <w:rPr>
+          <w:sz w:val="24"/>
+          <w:szCs w:val="24"/>
+        </w:rPr>
+        <w:t>{</w:t>
+      </w:r>
+    </w:p>
+    <w:p>
+      <w:pPr>
+        <w:shd w:val="clear" w:color="auto" w:fill="F2F2F2" w:themeFill="background1" w:themeFillShade="F2"/>
+        <w:spacing w:after="0" w:line="240" w:lineRule="auto"/>
+        <w:ind w:left="425"/>
+        <w:jc w:val="both"/>
+        <w:rPr>
+          <w:sz w:val="24"/>
+          <w:szCs w:val="24"/>
+        </w:rPr>
+      </w:pPr>
+      <w:r>
+        <w:rPr>
+          <w:sz w:val="24"/>
+          <w:szCs w:val="24"/>
+        </w:rPr>
+        <w:t xml:space="preserve">  "bezeroak": [</w:t>
+      </w:r>
+    </w:p>
+    <w:p>
+      <w:pPr>
+        <w:shd w:val="clear" w:color="auto" w:fill="F2F2F2" w:themeFill="background1" w:themeFillShade="F2"/>
+        <w:spacing w:after="0" w:line="240" w:lineRule="auto"/>
+        <w:ind w:left="425"/>
+        <w:jc w:val="both"/>
+        <w:rPr>
+          <w:sz w:val="24"/>
+          <w:szCs w:val="24"/>
+        </w:rPr>
+      </w:pPr>
+      <w:r>
+        <w:rPr>
+          <w:sz w:val="24"/>
+          <w:szCs w:val="24"/>
+        </w:rPr>
+        <w:t xml:space="preserve">    {</w:t>
+      </w:r>
+    </w:p>
+    <w:p>
+      <w:pPr>
+        <w:shd w:val="clear" w:color="auto" w:fill="F2F2F2" w:themeFill="background1" w:themeFillShade="F2"/>
+        <w:spacing w:after="0" w:line="240" w:lineRule="auto"/>
+        <w:ind w:left="425"/>
+        <w:jc w:val="both"/>
+        <w:rPr>
+          <w:sz w:val="24"/>
+          <w:szCs w:val="24"/>
+        </w:rPr>
+      </w:pPr>
+      <w:r>
+        <w:rPr>
+          <w:sz w:val="24"/>
+          <w:szCs w:val="24"/>
+        </w:rPr>
+        <w:t xml:space="preserve">      "id": 1,</w:t>
+      </w:r>
+    </w:p>
+    <w:p>
+      <w:pPr>
+        <w:shd w:val="clear" w:color="auto" w:fill="F2F2F2" w:themeFill="background1" w:themeFillShade="F2"/>
+        <w:spacing w:after="0" w:line="240" w:lineRule="auto"/>
+        <w:ind w:left="425"/>
+        <w:jc w:val="both"/>
+        <w:rPr>
+          <w:sz w:val="24"/>
+          <w:szCs w:val="24"/>
+        </w:rPr>
+      </w:pPr>
+      <w:r>
+        <w:rPr>
+          <w:sz w:val="24"/>
+          <w:szCs w:val="24"/>
+        </w:rPr>
+        <w:t xml:space="preserve">      "izena": "...",</w:t>
+      </w:r>
+    </w:p>
+    <w:p>
+      <w:pPr>
+        <w:shd w:val="clear" w:color="auto" w:fill="F2F2F2" w:themeFill="background1" w:themeFillShade="F2"/>
+        <w:spacing w:after="0" w:line="240" w:lineRule="auto"/>
+        <w:ind w:left="425"/>
+        <w:jc w:val="both"/>
+        <w:rPr>
+          <w:sz w:val="24"/>
+          <w:szCs w:val="24"/>
+        </w:rPr>
+      </w:pPr>
+      <w:r>
+        <w:rPr>
+          <w:sz w:val="24"/>
+          <w:szCs w:val="24"/>
+        </w:rPr>
+        <w:t xml:space="preserve">      "emaila": "...",</w:t>
+      </w:r>
+    </w:p>
+    <w:p>
+      <w:pPr>
+        <w:shd w:val="clear" w:color="auto" w:fill="F2F2F2" w:themeFill="background1" w:themeFillShade="F2"/>
+        <w:spacing w:after="0" w:line="240" w:lineRule="auto"/>
+        <w:ind w:left="425"/>
+        <w:jc w:val="both"/>
+        <w:rPr>
+          <w:sz w:val="24"/>
+          <w:szCs w:val="24"/>
+        </w:rPr>
+      </w:pPr>
+      <w:r>
+        <w:rPr>
+          <w:sz w:val="24"/>
+          <w:szCs w:val="24"/>
+        </w:rPr>
+        <w:t xml:space="preserve">      "hiria": "...",</w:t>
+      </w:r>
+    </w:p>
+    <w:p>
+      <w:pPr>
+        <w:shd w:val="clear" w:color="auto" w:fill="F2F2F2" w:themeFill="background1" w:themeFillShade="F2"/>
+        <w:spacing w:after="0" w:line="240" w:lineRule="auto"/>
+        <w:ind w:left="425"/>
+        <w:jc w:val="both"/>
+        <w:rPr>
+          <w:sz w:val="24"/>
+          <w:szCs w:val="24"/>
+        </w:rPr>
+      </w:pPr>
+      <w:r>
+        <w:rPr>
+          <w:sz w:val="24"/>
+          <w:szCs w:val="24"/>
+        </w:rPr>
+        <w:t xml:space="preserve">      "adina": 34</w:t>
+      </w:r>
+    </w:p>
+    <w:p>
+      <w:pPr>
+        <w:shd w:val="clear" w:color="auto" w:fill="F2F2F2" w:themeFill="background1" w:themeFillShade="F2"/>
+        <w:spacing w:after="0" w:line="240" w:lineRule="auto"/>
+        <w:ind w:left="425"/>
+        <w:jc w:val="both"/>
+        <w:rPr>
+          <w:sz w:val="24"/>
+          <w:szCs w:val="24"/>
+        </w:rPr>
+      </w:pPr>
+      <w:r>
+        <w:rPr>
+          <w:sz w:val="24"/>
+          <w:szCs w:val="24"/>
+        </w:rPr>
+        <w:t xml:space="preserve">    }</w:t>
+      </w:r>
+    </w:p>
+    <w:p>
+      <w:pPr>
+        <w:shd w:val="clear" w:color="auto" w:fill="F2F2F2" w:themeFill="background1" w:themeFillShade="F2"/>
+        <w:spacing w:after="0" w:line="240" w:lineRule="auto"/>
+        <w:ind w:left="425"/>
+        <w:jc w:val="both"/>
+        <w:rPr>
+          <w:sz w:val="24"/>
+          <w:szCs w:val="24"/>
+        </w:rPr>
+      </w:pPr>
+      <w:r>
+        <w:rPr>
+          <w:sz w:val="24"/>
+          <w:szCs w:val="24"/>
+        </w:rPr>
+        <w:t xml:space="preserve">  ]</w:t>
+      </w:r>
+    </w:p>
+    <w:p>
+      <w:pPr>
+        <w:shd w:val="clear" w:color="auto" w:fill="F2F2F2" w:themeFill="background1" w:themeFillShade="F2"/>
+        <w:spacing w:after="0" w:line="240" w:lineRule="auto"/>
+        <w:ind w:left="425"/>
+        <w:jc w:val="both"/>
+        <w:rPr>
+          <w:sz w:val="24"/>
+          <w:szCs w:val="24"/>
+        </w:rPr>
+      </w:pPr>
+      <w:r>
+        <w:rPr>
+          <w:sz w:val="24"/>
+          <w:szCs w:val="24"/>
+        </w:rPr>
+        <w:t>}</w:t>
+      </w:r>
+    </w:p>
+    <w:p>
+      <w:pPr>
+        <w:ind w:left="426"/>
+        <w:jc w:val="both"/>
+        <w:rPr>
+          <w:sz w:val="24"/>
+          <w:szCs w:val="24"/>
+        </w:rPr>
+      </w:pPr>
+    </w:p>
+    <w:p>
+      <w:pPr>
+        <w:ind w:left="426"/>
+        <w:jc w:val="both"/>
+        <w:rPr>
+          <w:sz w:val="24"/>
+          <w:szCs w:val="24"/>
+        </w:rPr>
+      </w:pPr>
+      <w:r>
+        <w:rPr>
+          <w:sz w:val="24"/>
+          <w:szCs w:val="24"/>
+        </w:rPr>
+        <w:t>Erantzun:</w:t>
+      </w:r>
+    </w:p>
+    <w:p>
+      <w:pPr>
+        <w:pStyle w:val="Zerrenda-paragrafoa"/>
+        <w:numPr>
+          <w:ilvl w:val="0"/>
+          <w:numId w:val="18"/>
+        </w:numPr>
+        <w:jc w:val="both"/>
+        <w:rPr>
+          <w:sz w:val="24"/>
+          <w:szCs w:val="24"/>
+        </w:rPr>
+      </w:pPr>
+      <w:r>
+        <w:rPr>
+          <w:sz w:val="24"/>
+          <w:szCs w:val="24"/>
+        </w:rPr>
+        <w:t>Zein fitxategi da gizakiarentzat irakurterrazagoa?</w:t>
+      </w:r>
+    </w:p>
+    <w:p>
+      <w:pPr>
+        <w:pStyle w:val="Zerrenda-paragrafoa"/>
+        <w:numPr>
+          <w:ilvl w:val="0"/>
+          <w:numId w:val="18"/>
+        </w:numPr>
+        <w:jc w:val="both"/>
+        <w:rPr>
+          <w:sz w:val="24"/>
+          <w:szCs w:val="24"/>
+        </w:rPr>
+      </w:pPr>
+      <w:r>
+        <w:rPr>
+          <w:sz w:val="24"/>
+          <w:szCs w:val="24"/>
+        </w:rPr>
+        <w:t>Zeinek dauka egitura esplizituagoa?</w:t>
+      </w:r>
+    </w:p>
+    <w:p>
+      <w:pPr>
+        <w:pStyle w:val="Zerrenda-paragrafoa"/>
+        <w:numPr>
+          <w:ilvl w:val="0"/>
+          <w:numId w:val="18"/>
+        </w:numPr>
+        <w:jc w:val="both"/>
+        <w:rPr>
+          <w:sz w:val="24"/>
+          <w:szCs w:val="24"/>
+        </w:rPr>
+      </w:pPr>
+      <w:r>
+        <w:rPr>
+          <w:sz w:val="24"/>
+          <w:szCs w:val="24"/>
+        </w:rPr>
+        <w:t>JSON-</w:t>
+      </w:r>
+      <w:proofErr w:type="spellStart"/>
+      <w:r>
+        <w:rPr>
+          <w:sz w:val="24"/>
+          <w:szCs w:val="24"/>
+        </w:rPr>
+        <w:t>en</w:t>
+      </w:r>
+      <w:proofErr w:type="spellEnd"/>
+      <w:r>
+        <w:rPr>
+          <w:sz w:val="24"/>
+          <w:szCs w:val="24"/>
+        </w:rPr>
+        <w:t xml:space="preserve"> non gordetzen dira zutabe-izenak?</w:t>
+      </w:r>
+    </w:p>
+    <w:p>
+      <w:pPr>
+        <w:pStyle w:val="Zerrenda-paragrafoa"/>
+        <w:numPr>
+          <w:ilvl w:val="0"/>
+          <w:numId w:val="18"/>
+        </w:numPr>
+        <w:jc w:val="both"/>
+        <w:rPr>
+          <w:sz w:val="24"/>
+          <w:szCs w:val="24"/>
+        </w:rPr>
+      </w:pPr>
+      <w:r>
+        <w:rPr>
+          <w:sz w:val="24"/>
+          <w:szCs w:val="24"/>
+        </w:rPr>
+        <w:t>10 milioi erregistro balira, egokia litzateke JSON osoa memoria batean eraikitzea?</w:t>
+      </w:r>
+    </w:p>
+    <w:p>
+      <w:pPr>
+        <w:jc w:val="both"/>
+        <w:rPr>
+          <w:sz w:val="24"/>
+          <w:szCs w:val="24"/>
+        </w:rPr>
+      </w:pPr>
+    </w:p>
+    <w:p>
+      <w:pPr>
+        <w:pStyle w:val="Zerrenda-paragrafoa"/>
+        <w:numPr>
+          <w:ilvl w:val="0"/>
+          <w:numId w:val="1"/>
+        </w:numPr>
+        <w:ind w:left="426"/>
+        <w:jc w:val="both"/>
+        <w:rPr>
+          <w:b/>
+          <w:bCs/>
+          <w:sz w:val="24"/>
+          <w:szCs w:val="24"/>
+          <w:u w:val="single"/>
+        </w:rPr>
+      </w:pPr>
+      <w:r>
+        <w:rPr>
+          <w:b/>
+          <w:bCs/>
+          <w:sz w:val="24"/>
+          <w:szCs w:val="24"/>
+          <w:u w:val="single"/>
+        </w:rPr>
+        <w:t>Erronka: salmenta-</w:t>
+      </w:r>
+      <w:proofErr w:type="spellStart"/>
+      <w:r>
+        <w:rPr>
+          <w:b/>
+          <w:bCs/>
+          <w:sz w:val="24"/>
+          <w:szCs w:val="24"/>
+          <w:u w:val="single"/>
+        </w:rPr>
+        <w:t>dataset</w:t>
+      </w:r>
+      <w:proofErr w:type="spellEnd"/>
+      <w:r>
+        <w:rPr>
+          <w:b/>
+          <w:bCs/>
+          <w:sz w:val="24"/>
+          <w:szCs w:val="24"/>
+          <w:u w:val="single"/>
+        </w:rPr>
+        <w:t xml:space="preserve"> sintetikoa</w:t>
+      </w:r>
+    </w:p>
+    <w:p>
+      <w:pPr>
+        <w:spacing w:after="40"/>
+        <w:ind w:left="425"/>
+        <w:jc w:val="both"/>
+        <w:rPr>
+          <w:sz w:val="24"/>
+          <w:szCs w:val="24"/>
+        </w:rPr>
+      </w:pPr>
+      <w:r>
+        <w:rPr>
+          <w:sz w:val="24"/>
+          <w:szCs w:val="24"/>
+        </w:rPr>
+        <w:t xml:space="preserve">Sortu </w:t>
+      </w:r>
+      <w:proofErr w:type="spellStart"/>
+      <w:r>
+        <w:rPr>
+          <w:sz w:val="24"/>
+          <w:szCs w:val="24"/>
+        </w:rPr>
+        <w:t>Faker</w:t>
+      </w:r>
+      <w:proofErr w:type="spellEnd"/>
+      <w:r>
+        <w:rPr>
+          <w:sz w:val="24"/>
+          <w:szCs w:val="24"/>
+        </w:rPr>
+        <w:t xml:space="preserve"> erabiliz 10.000 salmentako </w:t>
+      </w:r>
+      <w:proofErr w:type="spellStart"/>
+      <w:r>
+        <w:rPr>
+          <w:sz w:val="24"/>
+          <w:szCs w:val="24"/>
+        </w:rPr>
+        <w:t>dataset</w:t>
+      </w:r>
+      <w:proofErr w:type="spellEnd"/>
+      <w:r>
+        <w:rPr>
+          <w:sz w:val="24"/>
+          <w:szCs w:val="24"/>
+        </w:rPr>
+        <w:t xml:space="preserve"> sintetikoa:</w:t>
+      </w:r>
+    </w:p>
+    <w:p>
+      <w:pPr>
+        <w:pStyle w:val="Zerrenda-paragrafoa"/>
+        <w:numPr>
+          <w:ilvl w:val="0"/>
+          <w:numId w:val="15"/>
+        </w:numPr>
+        <w:spacing w:after="0"/>
+        <w:ind w:left="1145" w:hanging="357"/>
+        <w:jc w:val="both"/>
+        <w:rPr>
+          <w:sz w:val="24"/>
+          <w:szCs w:val="24"/>
+        </w:rPr>
+      </w:pPr>
+      <w:r>
+        <w:rPr>
+          <w:sz w:val="24"/>
+          <w:szCs w:val="24"/>
+        </w:rPr>
+        <w:t>id</w:t>
+      </w:r>
+    </w:p>
+    <w:p>
+      <w:pPr>
+        <w:pStyle w:val="Zerrenda-paragrafoa"/>
+        <w:numPr>
+          <w:ilvl w:val="0"/>
+          <w:numId w:val="15"/>
+        </w:numPr>
+        <w:spacing w:after="0"/>
+        <w:ind w:left="1145" w:hanging="357"/>
+        <w:jc w:val="both"/>
+        <w:rPr>
+          <w:sz w:val="24"/>
+          <w:szCs w:val="24"/>
+        </w:rPr>
+      </w:pPr>
+      <w:r>
+        <w:rPr>
+          <w:sz w:val="24"/>
+          <w:szCs w:val="24"/>
+        </w:rPr>
+        <w:t>data</w:t>
+      </w:r>
+    </w:p>
+    <w:p>
+      <w:pPr>
+        <w:pStyle w:val="Zerrenda-paragrafoa"/>
+        <w:numPr>
+          <w:ilvl w:val="0"/>
+          <w:numId w:val="15"/>
+        </w:numPr>
+        <w:spacing w:after="0"/>
+        <w:ind w:left="1145" w:hanging="357"/>
+        <w:jc w:val="both"/>
+        <w:rPr>
+          <w:sz w:val="24"/>
+          <w:szCs w:val="24"/>
+        </w:rPr>
+      </w:pPr>
+      <w:r>
+        <w:rPr>
+          <w:sz w:val="24"/>
+          <w:szCs w:val="24"/>
+        </w:rPr>
+        <w:t>bezeroa</w:t>
+      </w:r>
+    </w:p>
+    <w:p>
+      <w:pPr>
+        <w:pStyle w:val="Zerrenda-paragrafoa"/>
+        <w:numPr>
+          <w:ilvl w:val="0"/>
+          <w:numId w:val="15"/>
+        </w:numPr>
+        <w:spacing w:after="0"/>
+        <w:ind w:left="1145" w:hanging="357"/>
+        <w:jc w:val="both"/>
+        <w:rPr>
+          <w:sz w:val="24"/>
+          <w:szCs w:val="24"/>
+        </w:rPr>
+      </w:pPr>
+      <w:r>
+        <w:rPr>
+          <w:sz w:val="24"/>
+          <w:szCs w:val="24"/>
+        </w:rPr>
+        <w:t>hiria</w:t>
+      </w:r>
+    </w:p>
+    <w:p>
+      <w:pPr>
+        <w:pStyle w:val="Zerrenda-paragrafoa"/>
+        <w:numPr>
+          <w:ilvl w:val="0"/>
+          <w:numId w:val="15"/>
+        </w:numPr>
+        <w:jc w:val="both"/>
+        <w:rPr>
+          <w:sz w:val="24"/>
+          <w:szCs w:val="24"/>
+        </w:rPr>
+      </w:pPr>
+      <w:r>
+        <w:rPr>
+          <w:sz w:val="24"/>
+          <w:szCs w:val="24"/>
+        </w:rPr>
+        <w:t>produktua</w:t>
+      </w:r>
+    </w:p>
+    <w:p>
+      <w:pPr>
+        <w:pStyle w:val="Zerrenda-paragrafoa"/>
+        <w:numPr>
+          <w:ilvl w:val="0"/>
+          <w:numId w:val="15"/>
+        </w:numPr>
+        <w:jc w:val="both"/>
+        <w:rPr>
+          <w:sz w:val="24"/>
+          <w:szCs w:val="24"/>
+        </w:rPr>
+      </w:pPr>
+      <w:r>
+        <w:rPr>
+          <w:sz w:val="24"/>
+          <w:szCs w:val="24"/>
+        </w:rPr>
+        <w:t>kategoria</w:t>
+      </w:r>
+    </w:p>
+    <w:p>
+      <w:pPr>
+        <w:pStyle w:val="Zerrenda-paragrafoa"/>
+        <w:numPr>
+          <w:ilvl w:val="0"/>
+          <w:numId w:val="15"/>
+        </w:numPr>
+        <w:jc w:val="both"/>
+        <w:rPr>
+          <w:sz w:val="24"/>
+          <w:szCs w:val="24"/>
+        </w:rPr>
+      </w:pPr>
+      <w:r>
+        <w:rPr>
+          <w:sz w:val="24"/>
+          <w:szCs w:val="24"/>
+        </w:rPr>
+        <w:t>prezioa</w:t>
+      </w:r>
+    </w:p>
+    <w:p>
+      <w:pPr>
+        <w:pStyle w:val="Zerrenda-paragrafoa"/>
+        <w:numPr>
+          <w:ilvl w:val="0"/>
+          <w:numId w:val="15"/>
+        </w:numPr>
+        <w:jc w:val="both"/>
+        <w:rPr>
+          <w:sz w:val="24"/>
+          <w:szCs w:val="24"/>
+        </w:rPr>
+      </w:pPr>
+      <w:r>
+        <w:rPr>
+          <w:sz w:val="24"/>
+          <w:szCs w:val="24"/>
+        </w:rPr>
+        <w:t>unitateak</w:t>
+      </w:r>
+    </w:p>
+    <w:p>
+      <w:pPr>
+        <w:ind w:left="426"/>
+        <w:jc w:val="both"/>
+        <w:rPr>
+          <w:sz w:val="24"/>
+          <w:szCs w:val="24"/>
+        </w:rPr>
+      </w:pPr>
+    </w:p>
+    <w:p>
+      <w:pPr>
+        <w:ind w:left="426"/>
+        <w:jc w:val="both"/>
+        <w:rPr>
+          <w:sz w:val="24"/>
+          <w:szCs w:val="24"/>
+        </w:rPr>
+      </w:pPr>
+      <w:r>
+        <w:rPr>
+          <w:sz w:val="24"/>
+          <w:szCs w:val="24"/>
+        </w:rPr>
+        <w:lastRenderedPageBreak/>
+        <w:t>Baldintzak:</w:t>
+      </w:r>
+    </w:p>
+    <w:p>
+      <w:pPr>
+        <w:pStyle w:val="Zerrenda-paragrafoa"/>
+        <w:numPr>
+          <w:ilvl w:val="0"/>
+          <w:numId w:val="16"/>
+        </w:numPr>
+        <w:ind w:left="1134"/>
+        <w:jc w:val="both"/>
+        <w:rPr>
+          <w:sz w:val="24"/>
+          <w:szCs w:val="24"/>
+        </w:rPr>
+      </w:pPr>
+      <w:proofErr w:type="spellStart"/>
+      <w:r>
+        <w:rPr>
+          <w:sz w:val="24"/>
+          <w:szCs w:val="24"/>
+        </w:rPr>
+        <w:t>Faker</w:t>
+      </w:r>
+      <w:proofErr w:type="spellEnd"/>
+      <w:r>
+        <w:rPr>
+          <w:sz w:val="24"/>
+          <w:szCs w:val="24"/>
+        </w:rPr>
+        <w:t>(‘</w:t>
+      </w:r>
+      <w:proofErr w:type="spellStart"/>
+      <w:r>
+        <w:rPr>
+          <w:sz w:val="24"/>
+          <w:szCs w:val="24"/>
+        </w:rPr>
+        <w:t>es_ES</w:t>
+      </w:r>
+      <w:proofErr w:type="spellEnd"/>
+      <w:r>
+        <w:rPr>
+          <w:sz w:val="24"/>
+          <w:szCs w:val="24"/>
+        </w:rPr>
+        <w:t>’)</w:t>
+      </w:r>
+    </w:p>
+    <w:p>
+      <w:pPr>
+        <w:pStyle w:val="Zerrenda-paragrafoa"/>
+        <w:numPr>
+          <w:ilvl w:val="0"/>
+          <w:numId w:val="16"/>
+        </w:numPr>
+        <w:ind w:left="1134"/>
+        <w:jc w:val="both"/>
+        <w:rPr>
+          <w:sz w:val="24"/>
+          <w:szCs w:val="24"/>
+        </w:rPr>
+      </w:pPr>
+      <w:proofErr w:type="spellStart"/>
+      <w:r>
+        <w:rPr>
+          <w:sz w:val="24"/>
+          <w:szCs w:val="24"/>
+        </w:rPr>
+        <w:t>Faker.seed</w:t>
+      </w:r>
+      <w:proofErr w:type="spellEnd"/>
+      <w:r>
+        <w:rPr>
+          <w:sz w:val="24"/>
+          <w:szCs w:val="24"/>
+        </w:rPr>
+        <w:t>(42)</w:t>
+      </w:r>
+    </w:p>
+    <w:p>
+      <w:pPr>
+        <w:pStyle w:val="Zerrenda-paragrafoa"/>
+        <w:numPr>
+          <w:ilvl w:val="0"/>
+          <w:numId w:val="16"/>
+        </w:numPr>
+        <w:ind w:left="1134"/>
+        <w:jc w:val="both"/>
+        <w:rPr>
+          <w:sz w:val="24"/>
+          <w:szCs w:val="24"/>
+        </w:rPr>
+      </w:pPr>
+      <w:r>
+        <w:rPr>
+          <w:sz w:val="24"/>
+          <w:szCs w:val="24"/>
+        </w:rPr>
+        <w:t>Prezioa: 5-2000€</w:t>
+      </w:r>
+    </w:p>
+    <w:p>
+      <w:pPr>
+        <w:pStyle w:val="Zerrenda-paragrafoa"/>
+        <w:numPr>
+          <w:ilvl w:val="0"/>
+          <w:numId w:val="16"/>
+        </w:numPr>
+        <w:ind w:left="1134"/>
+        <w:jc w:val="both"/>
+        <w:rPr>
+          <w:sz w:val="24"/>
+          <w:szCs w:val="24"/>
+        </w:rPr>
+      </w:pPr>
+      <w:r>
+        <w:rPr>
+          <w:sz w:val="24"/>
+          <w:szCs w:val="24"/>
+        </w:rPr>
+        <w:t>Unitatea: 1-10</w:t>
+      </w:r>
+    </w:p>
+    <w:p>
+      <w:pPr>
+        <w:pStyle w:val="Zerrenda-paragrafoa"/>
+        <w:numPr>
+          <w:ilvl w:val="0"/>
+          <w:numId w:val="16"/>
+        </w:numPr>
+        <w:ind w:left="1134"/>
+        <w:jc w:val="both"/>
+        <w:rPr>
+          <w:sz w:val="24"/>
+          <w:szCs w:val="24"/>
+        </w:rPr>
+      </w:pPr>
+      <w:r>
+        <w:rPr>
+          <w:sz w:val="24"/>
+          <w:szCs w:val="24"/>
+        </w:rPr>
+        <w:t>Kategoriak: Ordenagailuak, Osagaiak, Periferikoak, Sareak</w:t>
+      </w:r>
+    </w:p>
+    <w:p>
+      <w:pPr>
+        <w:pStyle w:val="Zerrenda-paragrafoa"/>
+        <w:numPr>
+          <w:ilvl w:val="0"/>
+          <w:numId w:val="16"/>
+        </w:numPr>
+        <w:ind w:left="1134"/>
+        <w:jc w:val="both"/>
+        <w:rPr>
+          <w:sz w:val="24"/>
+          <w:szCs w:val="24"/>
+        </w:rPr>
+      </w:pPr>
+      <w:r>
+        <w:rPr>
+          <w:sz w:val="24"/>
+          <w:szCs w:val="24"/>
+        </w:rPr>
+        <w:t>Gutxienez 10.000 erregistro</w:t>
+      </w:r>
+    </w:p>
+    <w:p>
+      <w:pPr>
+        <w:jc w:val="both"/>
+        <w:rPr>
+          <w:sz w:val="24"/>
+          <w:szCs w:val="24"/>
+        </w:rPr>
+      </w:pPr>
+      <w:r>
+        <w:rPr>
+          <w:sz w:val="24"/>
+          <w:szCs w:val="24"/>
+        </w:rPr>
+        <w:t xml:space="preserve">Programa exekutatzean </w:t>
+      </w:r>
+      <w:r>
+        <w:rPr>
+          <w:b/>
+          <w:bCs/>
+          <w:sz w:val="24"/>
+          <w:szCs w:val="24"/>
+        </w:rPr>
+        <w:t>bi</w:t>
+      </w:r>
+      <w:r>
+        <w:rPr>
+          <w:b/>
+          <w:bCs/>
+          <w:sz w:val="24"/>
+          <w:szCs w:val="24"/>
+        </w:rPr>
+        <w:t xml:space="preserve"> fitxategi</w:t>
+      </w:r>
+      <w:r>
+        <w:rPr>
+          <w:sz w:val="24"/>
+          <w:szCs w:val="24"/>
+        </w:rPr>
+        <w:t xml:space="preserve"> sortu behar dira:</w:t>
+      </w:r>
+    </w:p>
+    <w:p>
+      <w:pPr>
+        <w:pStyle w:val="Zerrenda-paragrafoa"/>
+        <w:numPr>
+          <w:ilvl w:val="0"/>
+          <w:numId w:val="15"/>
+        </w:numPr>
+        <w:spacing w:after="0"/>
+        <w:ind w:left="1145" w:hanging="357"/>
+        <w:jc w:val="both"/>
+        <w:rPr>
+          <w:sz w:val="24"/>
+          <w:szCs w:val="24"/>
+        </w:rPr>
+      </w:pPr>
+      <w:r>
+        <w:rPr>
+          <w:sz w:val="24"/>
+          <w:szCs w:val="24"/>
+        </w:rPr>
+        <w:t>Salmentak.csv</w:t>
+      </w:r>
+    </w:p>
+    <w:p>
+      <w:pPr>
+        <w:pStyle w:val="Zerrenda-paragrafoa"/>
+        <w:numPr>
+          <w:ilvl w:val="0"/>
+          <w:numId w:val="15"/>
+        </w:numPr>
+        <w:spacing w:after="0"/>
+        <w:ind w:left="1145" w:hanging="357"/>
+        <w:jc w:val="both"/>
+        <w:rPr>
+          <w:sz w:val="24"/>
+          <w:szCs w:val="24"/>
+        </w:rPr>
+      </w:pPr>
+      <w:proofErr w:type="spellStart"/>
+      <w:r>
+        <w:rPr>
+          <w:sz w:val="24"/>
+          <w:szCs w:val="24"/>
+        </w:rPr>
+        <w:t>Salmentak.json</w:t>
+      </w:r>
+      <w:proofErr w:type="spellEnd"/>
+    </w:p>
+    <w:p>
+      <w:pPr>
+        <w:spacing w:after="0"/>
+        <w:jc w:val="both"/>
+        <w:rPr>
+          <w:sz w:val="24"/>
+          <w:szCs w:val="24"/>
+        </w:rPr>
+      </w:pPr>
+    </w:p>
+    <w:p>
+      <w:pPr>
+        <w:spacing w:after="0"/>
+        <w:jc w:val="both"/>
+        <w:rPr>
+          <w:sz w:val="24"/>
+          <w:szCs w:val="24"/>
+        </w:rPr>
+      </w:pPr>
+      <w:r>
+        <w:rPr>
+          <w:b/>
+          <w:bCs/>
+          <w:sz w:val="24"/>
+          <w:szCs w:val="24"/>
+        </w:rPr>
+        <w:t>Hausnarketa:</w:t>
+      </w:r>
+      <w:r>
+        <w:rPr>
+          <w:sz w:val="24"/>
+          <w:szCs w:val="24"/>
+        </w:rPr>
+        <w:t xml:space="preserve"> </w:t>
+      </w:r>
+      <w:proofErr w:type="spellStart"/>
+      <w:r>
+        <w:rPr>
+          <w:sz w:val="24"/>
+          <w:szCs w:val="24"/>
+        </w:rPr>
+        <w:t>Dataset</w:t>
+      </w:r>
+      <w:proofErr w:type="spellEnd"/>
+      <w:r>
+        <w:rPr>
+          <w:sz w:val="24"/>
+          <w:szCs w:val="24"/>
+        </w:rPr>
+        <w:t xml:space="preserve"> honek 10.000 erregistro izan beharrean 500 milioi izango balitu eta </w:t>
+      </w:r>
+      <w:proofErr w:type="spellStart"/>
+      <w:r>
+        <w:rPr>
+          <w:sz w:val="24"/>
+          <w:szCs w:val="24"/>
+        </w:rPr>
+        <w:t>Spark</w:t>
+      </w:r>
+      <w:proofErr w:type="spellEnd"/>
+      <w:r>
+        <w:rPr>
+          <w:sz w:val="24"/>
+          <w:szCs w:val="24"/>
+        </w:rPr>
+        <w:t>-ekin kategoria eta prezioa bakarrik analizatu nahi bagenitu, zein formatu erabiliko zenuke? Zergatik?</w:t>
+      </w:r>
+    </w:p>
+    <w:p>
+      <w:pPr>
+        <w:spacing w:after="0"/>
+        <w:jc w:val="both"/>
+        <w:rPr>
+          <w:sz w:val="24"/>
+          <w:szCs w:val="24"/>
+        </w:rPr>
+      </w:pPr>
+    </w:p>
+    <w:p>
+      <w:pPr>
+        <w:jc w:val="both"/>
+        <w:rPr>
+          <w:sz w:val="24"/>
+          <w:szCs w:val="24"/>
         </w:rPr>
       </w:pPr>
     </w:p>
@@ -2997,6 +5694,95 @@
     </w:lvl>
   </w:abstractNum>
   <w:abstractNum w:abstractNumId="1" w15:restartNumberingAfterBreak="0">
+    <w:nsid w:val="10997FC2"/>
+    <w:multiLevelType w:val="hybridMultilevel"/>
+    <w:tmpl w:val="E684FB94"/>
+    <w:lvl w:ilvl="0" w:tplc="D4EAC07C">
+      <w:start w:val="1"/>
+      <w:numFmt w:val="decimal"/>
+      <w:lvlText w:val="%1."/>
+      <w:lvlJc w:val="left"/>
+      <w:pPr>
+        <w:ind w:left="786" w:hanging="360"/>
+      </w:pPr>
+      <w:rPr>
+        <w:rFonts w:hint="default"/>
+      </w:rPr>
+    </w:lvl>
+    <w:lvl w:ilvl="1" w:tplc="042D0019" w:tentative="1">
+      <w:start w:val="1"/>
+      <w:numFmt w:val="lowerLetter"/>
+      <w:lvlText w:val="%2."/>
+      <w:lvlJc w:val="left"/>
+      <w:pPr>
+        <w:ind w:left="1506" w:hanging="360"/>
+      </w:pPr>
+    </w:lvl>
+    <w:lvl w:ilvl="2" w:tplc="042D001B" w:tentative="1">
+      <w:start w:val="1"/>
+      <w:numFmt w:val="lowerRoman"/>
+      <w:lvlText w:val="%3."/>
+      <w:lvlJc w:val="right"/>
+      <w:pPr>
+        <w:ind w:left="2226" w:hanging="180"/>
+      </w:pPr>
+    </w:lvl>
+    <w:lvl w:ilvl="3" w:tplc="042D000F" w:tentative="1">
+      <w:start w:val="1"/>
+      <w:numFmt w:val="decimal"/>
+      <w:lvlText w:val="%4."/>
+      <w:lvlJc w:val="left"/>
+      <w:pPr>
+        <w:ind w:left="2946" w:hanging="360"/>
+      </w:pPr>
+    </w:lvl>
+    <w:lvl w:ilvl="4" w:tplc="042D0019" w:tentative="1">
+      <w:start w:val="1"/>
+      <w:numFmt w:val="lowerLetter"/>
+      <w:lvlText w:val="%5."/>
+      <w:lvlJc w:val="left"/>
+      <w:pPr>
+        <w:ind w:left="3666" w:hanging="360"/>
+      </w:pPr>
+    </w:lvl>
+    <w:lvl w:ilvl="5" w:tplc="042D001B" w:tentative="1">
+      <w:start w:val="1"/>
+      <w:numFmt w:val="lowerRoman"/>
+      <w:lvlText w:val="%6."/>
+      <w:lvlJc w:val="right"/>
+      <w:pPr>
+        <w:ind w:left="4386" w:hanging="180"/>
+      </w:pPr>
+    </w:lvl>
+    <w:lvl w:ilvl="6" w:tplc="042D000F" w:tentative="1">
+      <w:start w:val="1"/>
+      <w:numFmt w:val="decimal"/>
+      <w:lvlText w:val="%7."/>
+      <w:lvlJc w:val="left"/>
+      <w:pPr>
+        <w:ind w:left="5106" w:hanging="360"/>
+      </w:pPr>
+    </w:lvl>
+    <w:lvl w:ilvl="7" w:tplc="042D0019" w:tentative="1">
+      <w:start w:val="1"/>
+      <w:numFmt w:val="lowerLetter"/>
+      <w:lvlText w:val="%8."/>
+      <w:lvlJc w:val="left"/>
+      <w:pPr>
+        <w:ind w:left="5826" w:hanging="360"/>
+      </w:pPr>
+    </w:lvl>
+    <w:lvl w:ilvl="8" w:tplc="042D001B" w:tentative="1">
+      <w:start w:val="1"/>
+      <w:numFmt w:val="lowerRoman"/>
+      <w:lvlText w:val="%9."/>
+      <w:lvlJc w:val="right"/>
+      <w:pPr>
+        <w:ind w:left="6546" w:hanging="180"/>
+      </w:pPr>
+    </w:lvl>
+  </w:abstractNum>
+  <w:abstractNum w:abstractNumId="2" w15:restartNumberingAfterBreak="0">
     <w:nsid w:val="15B43C86"/>
     <w:multiLevelType w:val="hybridMultilevel"/>
     <w:tmpl w:val="E05232E0"/>
@@ -3109,7 +5895,7 @@
       </w:rPr>
     </w:lvl>
   </w:abstractNum>
-  <w:abstractNum w:abstractNumId="2" w15:restartNumberingAfterBreak="0">
+  <w:abstractNum w:abstractNumId="3" w15:restartNumberingAfterBreak="0">
     <w:nsid w:val="1A641778"/>
     <w:multiLevelType w:val="hybridMultilevel"/>
     <w:tmpl w:val="1A0A5514"/>
@@ -3222,7 +6008,7 @@
       </w:rPr>
     </w:lvl>
   </w:abstractNum>
-  <w:abstractNum w:abstractNumId="3" w15:restartNumberingAfterBreak="0">
+  <w:abstractNum w:abstractNumId="4" w15:restartNumberingAfterBreak="0">
     <w:nsid w:val="21463A48"/>
     <w:multiLevelType w:val="hybridMultilevel"/>
     <w:tmpl w:val="493AC796"/>
@@ -3334,7 +6120,7 @@
       </w:rPr>
     </w:lvl>
   </w:abstractNum>
-  <w:abstractNum w:abstractNumId="4" w15:restartNumberingAfterBreak="0">
+  <w:abstractNum w:abstractNumId="5" w15:restartNumberingAfterBreak="0">
     <w:nsid w:val="293E6740"/>
     <w:multiLevelType w:val="hybridMultilevel"/>
     <w:tmpl w:val="BAB2ED90"/>
@@ -3447,7 +6233,7 @@
       </w:rPr>
     </w:lvl>
   </w:abstractNum>
-  <w:abstractNum w:abstractNumId="5" w15:restartNumberingAfterBreak="0">
+  <w:abstractNum w:abstractNumId="6" w15:restartNumberingAfterBreak="0">
     <w:nsid w:val="383B7194"/>
     <w:multiLevelType w:val="hybridMultilevel"/>
     <w:tmpl w:val="F570647A"/>
@@ -3544,7 +6330,96 @@
       </w:pPr>
     </w:lvl>
   </w:abstractNum>
-  <w:abstractNum w:abstractNumId="6" w15:restartNumberingAfterBreak="0">
+  <w:abstractNum w:abstractNumId="7" w15:restartNumberingAfterBreak="0">
+    <w:nsid w:val="39522C97"/>
+    <w:multiLevelType w:val="hybridMultilevel"/>
+    <w:tmpl w:val="B344CD5C"/>
+    <w:lvl w:ilvl="0" w:tplc="D64C9F4C">
+      <w:start w:val="1"/>
+      <w:numFmt w:val="lowerLetter"/>
+      <w:lvlText w:val="%1."/>
+      <w:lvlJc w:val="left"/>
+      <w:pPr>
+        <w:ind w:left="786" w:hanging="360"/>
+      </w:pPr>
+      <w:rPr>
+        <w:rFonts w:hint="default"/>
+      </w:rPr>
+    </w:lvl>
+    <w:lvl w:ilvl="1" w:tplc="042D0019" w:tentative="1">
+      <w:start w:val="1"/>
+      <w:numFmt w:val="lowerLetter"/>
+      <w:lvlText w:val="%2."/>
+      <w:lvlJc w:val="left"/>
+      <w:pPr>
+        <w:ind w:left="1506" w:hanging="360"/>
+      </w:pPr>
+    </w:lvl>
+    <w:lvl w:ilvl="2" w:tplc="042D001B" w:tentative="1">
+      <w:start w:val="1"/>
+      <w:numFmt w:val="lowerRoman"/>
+      <w:lvlText w:val="%3."/>
+      <w:lvlJc w:val="right"/>
+      <w:pPr>
+        <w:ind w:left="2226" w:hanging="180"/>
+      </w:pPr>
+    </w:lvl>
+    <w:lvl w:ilvl="3" w:tplc="042D000F" w:tentative="1">
+      <w:start w:val="1"/>
+      <w:numFmt w:val="decimal"/>
+      <w:lvlText w:val="%4."/>
+      <w:lvlJc w:val="left"/>
+      <w:pPr>
+        <w:ind w:left="2946" w:hanging="360"/>
+      </w:pPr>
+    </w:lvl>
+    <w:lvl w:ilvl="4" w:tplc="042D0019" w:tentative="1">
+      <w:start w:val="1"/>
+      <w:numFmt w:val="lowerLetter"/>
+      <w:lvlText w:val="%5."/>
+      <w:lvlJc w:val="left"/>
+      <w:pPr>
+        <w:ind w:left="3666" w:hanging="360"/>
+      </w:pPr>
+    </w:lvl>
+    <w:lvl w:ilvl="5" w:tplc="042D001B" w:tentative="1">
+      <w:start w:val="1"/>
+      <w:numFmt w:val="lowerRoman"/>
+      <w:lvlText w:val="%6."/>
+      <w:lvlJc w:val="right"/>
+      <w:pPr>
+        <w:ind w:left="4386" w:hanging="180"/>
+      </w:pPr>
+    </w:lvl>
+    <w:lvl w:ilvl="6" w:tplc="042D000F" w:tentative="1">
+      <w:start w:val="1"/>
+      <w:numFmt w:val="decimal"/>
+      <w:lvlText w:val="%7."/>
+      <w:lvlJc w:val="left"/>
+      <w:pPr>
+        <w:ind w:left="5106" w:hanging="360"/>
+      </w:pPr>
+    </w:lvl>
+    <w:lvl w:ilvl="7" w:tplc="042D0019" w:tentative="1">
+      <w:start w:val="1"/>
+      <w:numFmt w:val="lowerLetter"/>
+      <w:lvlText w:val="%8."/>
+      <w:lvlJc w:val="left"/>
+      <w:pPr>
+        <w:ind w:left="5826" w:hanging="360"/>
+      </w:pPr>
+    </w:lvl>
+    <w:lvl w:ilvl="8" w:tplc="042D001B" w:tentative="1">
+      <w:start w:val="1"/>
+      <w:numFmt w:val="lowerRoman"/>
+      <w:lvlText w:val="%9."/>
+      <w:lvlJc w:val="right"/>
+      <w:pPr>
+        <w:ind w:left="6546" w:hanging="180"/>
+      </w:pPr>
+    </w:lvl>
+  </w:abstractNum>
+  <w:abstractNum w:abstractNumId="8" w15:restartNumberingAfterBreak="0">
     <w:nsid w:val="40C21742"/>
     <w:multiLevelType w:val="hybridMultilevel"/>
     <w:tmpl w:val="FF48042E"/>
@@ -3639,7 +6514,7 @@
       </w:pPr>
     </w:lvl>
   </w:abstractNum>
-  <w:abstractNum w:abstractNumId="7" w15:restartNumberingAfterBreak="0">
+  <w:abstractNum w:abstractNumId="9" w15:restartNumberingAfterBreak="0">
     <w:nsid w:val="46E15F8A"/>
     <w:multiLevelType w:val="multilevel"/>
     <w:tmpl w:val="A6709E9E"/>
@@ -3752,7 +6627,120 @@
       </w:rPr>
     </w:lvl>
   </w:abstractNum>
-  <w:abstractNum w:abstractNumId="8" w15:restartNumberingAfterBreak="0">
+  <w:abstractNum w:abstractNumId="10" w15:restartNumberingAfterBreak="0">
+    <w:nsid w:val="488E2C03"/>
+    <w:multiLevelType w:val="hybridMultilevel"/>
+    <w:tmpl w:val="373EACCE"/>
+    <w:lvl w:ilvl="0" w:tplc="7DB88A0A">
+      <w:start w:val="1"/>
+      <w:numFmt w:val="bullet"/>
+      <w:lvlText w:val="-"/>
+      <w:lvlJc w:val="left"/>
+      <w:pPr>
+        <w:ind w:left="720" w:hanging="360"/>
+      </w:pPr>
+      <w:rPr>
+        <w:rFonts w:ascii="Aptos" w:eastAsiaTheme="minorHAnsi" w:hAnsi="Aptos" w:cstheme="minorBidi" w:hint="default"/>
+      </w:rPr>
+    </w:lvl>
+    <w:lvl w:ilvl="1" w:tplc="042D0003" w:tentative="1">
+      <w:start w:val="1"/>
+      <w:numFmt w:val="bullet"/>
+      <w:lvlText w:val="o"/>
+      <w:lvlJc w:val="left"/>
+      <w:pPr>
+        <w:ind w:left="1440" w:hanging="360"/>
+      </w:pPr>
+      <w:rPr>
+        <w:rFonts w:ascii="Courier New" w:hAnsi="Courier New" w:cs="Courier New" w:hint="default"/>
+      </w:rPr>
+    </w:lvl>
+    <w:lvl w:ilvl="2" w:tplc="042D0005" w:tentative="1">
+      <w:start w:val="1"/>
+      <w:numFmt w:val="bullet"/>
+      <w:lvlText w:val=""/>
+      <w:lvlJc w:val="left"/>
+      <w:pPr>
+        <w:ind w:left="2160" w:hanging="360"/>
+      </w:pPr>
+      <w:rPr>
+        <w:rFonts w:ascii="Wingdings" w:hAnsi="Wingdings" w:hint="default"/>
+      </w:rPr>
+    </w:lvl>
+    <w:lvl w:ilvl="3" w:tplc="042D0001" w:tentative="1">
+      <w:start w:val="1"/>
+      <w:numFmt w:val="bullet"/>
+      <w:lvlText w:val=""/>
+      <w:lvlJc w:val="left"/>
+      <w:pPr>
+        <w:ind w:left="2880" w:hanging="360"/>
+      </w:pPr>
+      <w:rPr>
+        <w:rFonts w:ascii="Symbol" w:hAnsi="Symbol" w:hint="default"/>
+      </w:rPr>
+    </w:lvl>
+    <w:lvl w:ilvl="4" w:tplc="042D0003" w:tentative="1">
+      <w:start w:val="1"/>
+      <w:numFmt w:val="bullet"/>
+      <w:lvlText w:val="o"/>
+      <w:lvlJc w:val="left"/>
+      <w:pPr>
+        <w:ind w:left="3600" w:hanging="360"/>
+      </w:pPr>
+      <w:rPr>
+        <w:rFonts w:ascii="Courier New" w:hAnsi="Courier New" w:cs="Courier New" w:hint="default"/>
+      </w:rPr>
+    </w:lvl>
+    <w:lvl w:ilvl="5" w:tplc="042D0005" w:tentative="1">
+      <w:start w:val="1"/>
+      <w:numFmt w:val="bullet"/>
+      <w:lvlText w:val=""/>
+      <w:lvlJc w:val="left"/>
+      <w:pPr>
+        <w:ind w:left="4320" w:hanging="360"/>
+      </w:pPr>
+      <w:rPr>
+        <w:rFonts w:ascii="Wingdings" w:hAnsi="Wingdings" w:hint="default"/>
+      </w:rPr>
+    </w:lvl>
+    <w:lvl w:ilvl="6" w:tplc="042D0001" w:tentative="1">
+      <w:start w:val="1"/>
+      <w:numFmt w:val="bullet"/>
+      <w:lvlText w:val=""/>
+      <w:lvlJc w:val="left"/>
+      <w:pPr>
+        <w:ind w:left="5040" w:hanging="360"/>
+      </w:pPr>
+      <w:rPr>
+        <w:rFonts w:ascii="Symbol" w:hAnsi="Symbol" w:hint="default"/>
+      </w:rPr>
+    </w:lvl>
+    <w:lvl w:ilvl="7" w:tplc="042D0003" w:tentative="1">
+      <w:start w:val="1"/>
+      <w:numFmt w:val="bullet"/>
+      <w:lvlText w:val="o"/>
+      <w:lvlJc w:val="left"/>
+      <w:pPr>
+        <w:ind w:left="5760" w:hanging="360"/>
+      </w:pPr>
+      <w:rPr>
+        <w:rFonts w:ascii="Courier New" w:hAnsi="Courier New" w:cs="Courier New" w:hint="default"/>
+      </w:rPr>
+    </w:lvl>
+    <w:lvl w:ilvl="8" w:tplc="042D0005" w:tentative="1">
+      <w:start w:val="1"/>
+      <w:numFmt w:val="bullet"/>
+      <w:lvlText w:val=""/>
+      <w:lvlJc w:val="left"/>
+      <w:pPr>
+        <w:ind w:left="6480" w:hanging="360"/>
+      </w:pPr>
+      <w:rPr>
+        <w:rFonts w:ascii="Wingdings" w:hAnsi="Wingdings" w:hint="default"/>
+      </w:rPr>
+    </w:lvl>
+  </w:abstractNum>
+  <w:abstractNum w:abstractNumId="11" w15:restartNumberingAfterBreak="0">
     <w:nsid w:val="4A0906D7"/>
     <w:multiLevelType w:val="hybridMultilevel"/>
     <w:tmpl w:val="2670E6AA"/>
@@ -3865,7 +6853,120 @@
       </w:rPr>
     </w:lvl>
   </w:abstractNum>
-  <w:abstractNum w:abstractNumId="9" w15:restartNumberingAfterBreak="0">
+  <w:abstractNum w:abstractNumId="12" w15:restartNumberingAfterBreak="0">
+    <w:nsid w:val="4B4315C9"/>
+    <w:multiLevelType w:val="hybridMultilevel"/>
+    <w:tmpl w:val="FA22A682"/>
+    <w:lvl w:ilvl="0" w:tplc="042D0001">
+      <w:start w:val="1"/>
+      <w:numFmt w:val="bullet"/>
+      <w:lvlText w:val=""/>
+      <w:lvlJc w:val="left"/>
+      <w:pPr>
+        <w:ind w:left="1146" w:hanging="360"/>
+      </w:pPr>
+      <w:rPr>
+        <w:rFonts w:ascii="Symbol" w:hAnsi="Symbol" w:hint="default"/>
+      </w:rPr>
+    </w:lvl>
+    <w:lvl w:ilvl="1" w:tplc="042D0003" w:tentative="1">
+      <w:start w:val="1"/>
+      <w:numFmt w:val="bullet"/>
+      <w:lvlText w:val="o"/>
+      <w:lvlJc w:val="left"/>
+      <w:pPr>
+        <w:ind w:left="1866" w:hanging="360"/>
+      </w:pPr>
+      <w:rPr>
+        <w:rFonts w:ascii="Courier New" w:hAnsi="Courier New" w:cs="Courier New" w:hint="default"/>
+      </w:rPr>
+    </w:lvl>
+    <w:lvl w:ilvl="2" w:tplc="042D0005" w:tentative="1">
+      <w:start w:val="1"/>
+      <w:numFmt w:val="bullet"/>
+      <w:lvlText w:val=""/>
+      <w:lvlJc w:val="left"/>
+      <w:pPr>
+        <w:ind w:left="2586" w:hanging="360"/>
+      </w:pPr>
+      <w:rPr>
+        <w:rFonts w:ascii="Wingdings" w:hAnsi="Wingdings" w:hint="default"/>
+      </w:rPr>
+    </w:lvl>
+    <w:lvl w:ilvl="3" w:tplc="042D0001" w:tentative="1">
+      <w:start w:val="1"/>
+      <w:numFmt w:val="bullet"/>
+      <w:lvlText w:val=""/>
+      <w:lvlJc w:val="left"/>
+      <w:pPr>
+        <w:ind w:left="3306" w:hanging="360"/>
+      </w:pPr>
+      <w:rPr>
+        <w:rFonts w:ascii="Symbol" w:hAnsi="Symbol" w:hint="default"/>
+      </w:rPr>
+    </w:lvl>
+    <w:lvl w:ilvl="4" w:tplc="042D0003" w:tentative="1">
+      <w:start w:val="1"/>
+      <w:numFmt w:val="bullet"/>
+      <w:lvlText w:val="o"/>
+      <w:lvlJc w:val="left"/>
+      <w:pPr>
+        <w:ind w:left="4026" w:hanging="360"/>
+      </w:pPr>
+      <w:rPr>
+        <w:rFonts w:ascii="Courier New" w:hAnsi="Courier New" w:cs="Courier New" w:hint="default"/>
+      </w:rPr>
+    </w:lvl>
+    <w:lvl w:ilvl="5" w:tplc="042D0005" w:tentative="1">
+      <w:start w:val="1"/>
+      <w:numFmt w:val="bullet"/>
+      <w:lvlText w:val=""/>
+      <w:lvlJc w:val="left"/>
+      <w:pPr>
+        <w:ind w:left="4746" w:hanging="360"/>
+      </w:pPr>
+      <w:rPr>
+        <w:rFonts w:ascii="Wingdings" w:hAnsi="Wingdings" w:hint="default"/>
+      </w:rPr>
+    </w:lvl>
+    <w:lvl w:ilvl="6" w:tplc="042D0001" w:tentative="1">
+      <w:start w:val="1"/>
+      <w:numFmt w:val="bullet"/>
+      <w:lvlText w:val=""/>
+      <w:lvlJc w:val="left"/>
+      <w:pPr>
+        <w:ind w:left="5466" w:hanging="360"/>
+      </w:pPr>
+      <w:rPr>
+        <w:rFonts w:ascii="Symbol" w:hAnsi="Symbol" w:hint="default"/>
+      </w:rPr>
+    </w:lvl>
+    <w:lvl w:ilvl="7" w:tplc="042D0003" w:tentative="1">
+      <w:start w:val="1"/>
+      <w:numFmt w:val="bullet"/>
+      <w:lvlText w:val="o"/>
+      <w:lvlJc w:val="left"/>
+      <w:pPr>
+        <w:ind w:left="6186" w:hanging="360"/>
+      </w:pPr>
+      <w:rPr>
+        <w:rFonts w:ascii="Courier New" w:hAnsi="Courier New" w:cs="Courier New" w:hint="default"/>
+      </w:rPr>
+    </w:lvl>
+    <w:lvl w:ilvl="8" w:tplc="042D0005" w:tentative="1">
+      <w:start w:val="1"/>
+      <w:numFmt w:val="bullet"/>
+      <w:lvlText w:val=""/>
+      <w:lvlJc w:val="left"/>
+      <w:pPr>
+        <w:ind w:left="6906" w:hanging="360"/>
+      </w:pPr>
+      <w:rPr>
+        <w:rFonts w:ascii="Wingdings" w:hAnsi="Wingdings" w:hint="default"/>
+      </w:rPr>
+    </w:lvl>
+  </w:abstractNum>
+  <w:abstractNum w:abstractNumId="13" w15:restartNumberingAfterBreak="0">
     <w:nsid w:val="575471D7"/>
     <w:multiLevelType w:val="hybridMultilevel"/>
     <w:tmpl w:val="D6D0A576"/>
@@ -3954,7 +7055,7 @@
       </w:pPr>
     </w:lvl>
   </w:abstractNum>
-  <w:abstractNum w:abstractNumId="10" w15:restartNumberingAfterBreak="0">
+  <w:abstractNum w:abstractNumId="14" w15:restartNumberingAfterBreak="0">
     <w:nsid w:val="57EE1D69"/>
     <w:multiLevelType w:val="hybridMultilevel"/>
     <w:tmpl w:val="D512A060"/>
@@ -4066,7 +7167,7 @@
       </w:rPr>
     </w:lvl>
   </w:abstractNum>
-  <w:abstractNum w:abstractNumId="11" w15:restartNumberingAfterBreak="0">
+  <w:abstractNum w:abstractNumId="15" w15:restartNumberingAfterBreak="0">
     <w:nsid w:val="606B36A2"/>
     <w:multiLevelType w:val="multilevel"/>
     <w:tmpl w:val="EF1A3F9C"/>
@@ -4182,41 +7283,261 @@
       </w:pPr>
     </w:lvl>
   </w:abstractNum>
+  <w:abstractNum w:abstractNumId="16" w15:restartNumberingAfterBreak="0">
+    <w:nsid w:val="630335CF"/>
+    <w:multiLevelType w:val="hybridMultilevel"/>
+    <w:tmpl w:val="297A939C"/>
+    <w:lvl w:ilvl="0" w:tplc="FF4A3D3A">
+      <w:start w:val="1"/>
+      <w:numFmt w:val="decimal"/>
+      <w:lvlText w:val="%1."/>
+      <w:lvlJc w:val="left"/>
+      <w:pPr>
+        <w:ind w:left="785" w:hanging="360"/>
+      </w:pPr>
+      <w:rPr>
+        <w:rFonts w:hint="default"/>
+      </w:rPr>
+    </w:lvl>
+    <w:lvl w:ilvl="1" w:tplc="042D0019" w:tentative="1">
+      <w:start w:val="1"/>
+      <w:numFmt w:val="lowerLetter"/>
+      <w:lvlText w:val="%2."/>
+      <w:lvlJc w:val="left"/>
+      <w:pPr>
+        <w:ind w:left="1505" w:hanging="360"/>
+      </w:pPr>
+    </w:lvl>
+    <w:lvl w:ilvl="2" w:tplc="042D001B" w:tentative="1">
+      <w:start w:val="1"/>
+      <w:numFmt w:val="lowerRoman"/>
+      <w:lvlText w:val="%3."/>
+      <w:lvlJc w:val="right"/>
+      <w:pPr>
+        <w:ind w:left="2225" w:hanging="180"/>
+      </w:pPr>
+    </w:lvl>
+    <w:lvl w:ilvl="3" w:tplc="042D000F" w:tentative="1">
+      <w:start w:val="1"/>
+      <w:numFmt w:val="decimal"/>
+      <w:lvlText w:val="%4."/>
+      <w:lvlJc w:val="left"/>
+      <w:pPr>
+        <w:ind w:left="2945" w:hanging="360"/>
+      </w:pPr>
+    </w:lvl>
+    <w:lvl w:ilvl="4" w:tplc="042D0019" w:tentative="1">
+      <w:start w:val="1"/>
+      <w:numFmt w:val="lowerLetter"/>
+      <w:lvlText w:val="%5."/>
+      <w:lvlJc w:val="left"/>
+      <w:pPr>
+        <w:ind w:left="3665" w:hanging="360"/>
+      </w:pPr>
+    </w:lvl>
+    <w:lvl w:ilvl="5" w:tplc="042D001B" w:tentative="1">
+      <w:start w:val="1"/>
+      <w:numFmt w:val="lowerRoman"/>
+      <w:lvlText w:val="%6."/>
+      <w:lvlJc w:val="right"/>
+      <w:pPr>
+        <w:ind w:left="4385" w:hanging="180"/>
+      </w:pPr>
+    </w:lvl>
+    <w:lvl w:ilvl="6" w:tplc="042D000F" w:tentative="1">
+      <w:start w:val="1"/>
+      <w:numFmt w:val="decimal"/>
+      <w:lvlText w:val="%7."/>
+      <w:lvlJc w:val="left"/>
+      <w:pPr>
+        <w:ind w:left="5105" w:hanging="360"/>
+      </w:pPr>
+    </w:lvl>
+    <w:lvl w:ilvl="7" w:tplc="042D0019" w:tentative="1">
+      <w:start w:val="1"/>
+      <w:numFmt w:val="lowerLetter"/>
+      <w:lvlText w:val="%8."/>
+      <w:lvlJc w:val="left"/>
+      <w:pPr>
+        <w:ind w:left="5825" w:hanging="360"/>
+      </w:pPr>
+    </w:lvl>
+    <w:lvl w:ilvl="8" w:tplc="042D001B" w:tentative="1">
+      <w:start w:val="1"/>
+      <w:numFmt w:val="lowerRoman"/>
+      <w:lvlText w:val="%9."/>
+      <w:lvlJc w:val="right"/>
+      <w:pPr>
+        <w:ind w:left="6545" w:hanging="180"/>
+      </w:pPr>
+    </w:lvl>
+  </w:abstractNum>
+  <w:abstractNum w:abstractNumId="17" w15:restartNumberingAfterBreak="0">
+    <w:nsid w:val="7FF5311C"/>
+    <w:multiLevelType w:val="hybridMultilevel"/>
+    <w:tmpl w:val="6ACEDEEA"/>
+    <w:lvl w:ilvl="0" w:tplc="042D0001">
+      <w:start w:val="1"/>
+      <w:numFmt w:val="bullet"/>
+      <w:lvlText w:val=""/>
+      <w:lvlJc w:val="left"/>
+      <w:pPr>
+        <w:ind w:left="1146" w:hanging="360"/>
+      </w:pPr>
+      <w:rPr>
+        <w:rFonts w:ascii="Symbol" w:hAnsi="Symbol" w:hint="default"/>
+      </w:rPr>
+    </w:lvl>
+    <w:lvl w:ilvl="1" w:tplc="042D0003" w:tentative="1">
+      <w:start w:val="1"/>
+      <w:numFmt w:val="bullet"/>
+      <w:lvlText w:val="o"/>
+      <w:lvlJc w:val="left"/>
+      <w:pPr>
+        <w:ind w:left="1866" w:hanging="360"/>
+      </w:pPr>
+      <w:rPr>
+        <w:rFonts w:ascii="Courier New" w:hAnsi="Courier New" w:cs="Courier New" w:hint="default"/>
+      </w:rPr>
+    </w:lvl>
+    <w:lvl w:ilvl="2" w:tplc="042D0005" w:tentative="1">
+      <w:start w:val="1"/>
+      <w:numFmt w:val="bullet"/>
+      <w:lvlText w:val=""/>
+      <w:lvlJc w:val="left"/>
+      <w:pPr>
+        <w:ind w:left="2586" w:hanging="360"/>
+      </w:pPr>
+      <w:rPr>
+        <w:rFonts w:ascii="Wingdings" w:hAnsi="Wingdings" w:hint="default"/>
+      </w:rPr>
+    </w:lvl>
+    <w:lvl w:ilvl="3" w:tplc="042D0001" w:tentative="1">
+      <w:start w:val="1"/>
+      <w:numFmt w:val="bullet"/>
+      <w:lvlText w:val=""/>
+      <w:lvlJc w:val="left"/>
+      <w:pPr>
+        <w:ind w:left="3306" w:hanging="360"/>
+      </w:pPr>
+      <w:rPr>
+        <w:rFonts w:ascii="Symbol" w:hAnsi="Symbol" w:hint="default"/>
+      </w:rPr>
+    </w:lvl>
+    <w:lvl w:ilvl="4" w:tplc="042D0003" w:tentative="1">
+      <w:start w:val="1"/>
+      <w:numFmt w:val="bullet"/>
+      <w:lvlText w:val="o"/>
+      <w:lvlJc w:val="left"/>
+      <w:pPr>
+        <w:ind w:left="4026" w:hanging="360"/>
+      </w:pPr>
+      <w:rPr>
+        <w:rFonts w:ascii="Courier New" w:hAnsi="Courier New" w:cs="Courier New" w:hint="default"/>
+      </w:rPr>
+    </w:lvl>
+    <w:lvl w:ilvl="5" w:tplc="042D0005" w:tentative="1">
+      <w:start w:val="1"/>
+      <w:numFmt w:val="bullet"/>
+      <w:lvlText w:val=""/>
+      <w:lvlJc w:val="left"/>
+      <w:pPr>
+        <w:ind w:left="4746" w:hanging="360"/>
+      </w:pPr>
+      <w:rPr>
+        <w:rFonts w:ascii="Wingdings" w:hAnsi="Wingdings" w:hint="default"/>
+      </w:rPr>
+    </w:lvl>
+    <w:lvl w:ilvl="6" w:tplc="042D0001" w:tentative="1">
+      <w:start w:val="1"/>
+      <w:numFmt w:val="bullet"/>
+      <w:lvlText w:val=""/>
+      <w:lvlJc w:val="left"/>
+      <w:pPr>
+        <w:ind w:left="5466" w:hanging="360"/>
+      </w:pPr>
+      <w:rPr>
+        <w:rFonts w:ascii="Symbol" w:hAnsi="Symbol" w:hint="default"/>
+      </w:rPr>
+    </w:lvl>
+    <w:lvl w:ilvl="7" w:tplc="042D0003" w:tentative="1">
+      <w:start w:val="1"/>
+      <w:numFmt w:val="bullet"/>
+      <w:lvlText w:val="o"/>
+      <w:lvlJc w:val="left"/>
+      <w:pPr>
+        <w:ind w:left="6186" w:hanging="360"/>
+      </w:pPr>
+      <w:rPr>
+        <w:rFonts w:ascii="Courier New" w:hAnsi="Courier New" w:cs="Courier New" w:hint="default"/>
+      </w:rPr>
+    </w:lvl>
+    <w:lvl w:ilvl="8" w:tplc="042D0005" w:tentative="1">
+      <w:start w:val="1"/>
+      <w:numFmt w:val="bullet"/>
+      <w:lvlText w:val=""/>
+      <w:lvlJc w:val="left"/>
+      <w:pPr>
+        <w:ind w:left="6906" w:hanging="360"/>
+      </w:pPr>
+      <w:rPr>
+        <w:rFonts w:ascii="Wingdings" w:hAnsi="Wingdings" w:hint="default"/>
+      </w:rPr>
+    </w:lvl>
+  </w:abstractNum>
   <w:num w:numId="1" w16cid:durableId="2026205382">
-    <w:abstractNumId w:val="5"/>
+    <w:abstractNumId w:val="6"/>
   </w:num>
   <w:num w:numId="2" w16cid:durableId="61681863">
+    <w:abstractNumId w:val="15"/>
+  </w:num>
+  <w:num w:numId="3" w16cid:durableId="605773695">
     <w:abstractNumId w:val="11"/>
   </w:num>
-  <w:num w:numId="3" w16cid:durableId="605773695">
+  <w:num w:numId="4" w16cid:durableId="1753773427">
     <w:abstractNumId w:val="8"/>
   </w:num>
-  <w:num w:numId="4" w16cid:durableId="1753773427">
-    <w:abstractNumId w:val="6"/>
-  </w:num>
   <w:num w:numId="5" w16cid:durableId="505288842">
-    <w:abstractNumId w:val="7"/>
+    <w:abstractNumId w:val="9"/>
   </w:num>
   <w:num w:numId="6" w16cid:durableId="1542478414">
-    <w:abstractNumId w:val="2"/>
+    <w:abstractNumId w:val="3"/>
   </w:num>
   <w:num w:numId="7" w16cid:durableId="1802259787">
     <w:abstractNumId w:val="0"/>
   </w:num>
   <w:num w:numId="8" w16cid:durableId="1353457182">
-    <w:abstractNumId w:val="9"/>
+    <w:abstractNumId w:val="13"/>
   </w:num>
   <w:num w:numId="9" w16cid:durableId="2068910732">
+    <w:abstractNumId w:val="5"/>
+  </w:num>
+  <w:num w:numId="10" w16cid:durableId="1379427576">
     <w:abstractNumId w:val="4"/>
   </w:num>
-  <w:num w:numId="10" w16cid:durableId="1379427576">
-    <w:abstractNumId w:val="3"/>
+  <w:num w:numId="11" w16cid:durableId="78522996">
+    <w:abstractNumId w:val="14"/>
   </w:num>
-  <w:num w:numId="11" w16cid:durableId="78522996">
+  <w:num w:numId="12" w16cid:durableId="832798414">
+    <w:abstractNumId w:val="2"/>
+  </w:num>
+  <w:num w:numId="13" w16cid:durableId="2106338299">
+    <w:abstractNumId w:val="7"/>
+  </w:num>
+  <w:num w:numId="14" w16cid:durableId="961812880">
+    <w:abstractNumId w:val="1"/>
+  </w:num>
+  <w:num w:numId="15" w16cid:durableId="290405819">
+    <w:abstractNumId w:val="17"/>
+  </w:num>
+  <w:num w:numId="16" w16cid:durableId="1620407291">
     <w:abstractNumId w:val="10"/>
   </w:num>
-  <w:num w:numId="12" w16cid:durableId="832798414">
-    <w:abstractNumId w:val="1"/>
+  <w:num w:numId="17" w16cid:durableId="1444960775">
+    <w:abstractNumId w:val="16"/>
+  </w:num>
+  <w:num w:numId="18" w16cid:durableId="1952007344">
+    <w:abstractNumId w:val="12"/>
   </w:num>
 </w:numbering>
 </file>
@@ -5182,6 +8503,25 @@
     <w:uiPriority w:val="99"/>
     <w:rsid w:val="00665D03"/>
   </w:style>
+  <w:style w:type="table" w:styleId="Saretaduntaula">
+    <w:name w:val="Table Grid"/>
+    <w:basedOn w:val="Taulanormala"/>
+    <w:uiPriority w:val="39"/>
+    <w:rsid w:val="000C3388"/>
+    <w:pPr>
+      <w:spacing w:after="0" w:line="240" w:lineRule="auto"/>
+    </w:pPr>
+    <w:tblPr>
+      <w:tblBorders>
+        <w:top w:val="single" w:sz="4" w:space="0" w:color="auto"/>
+        <w:left w:val="single" w:sz="4" w:space="0" w:color="auto"/>
+        <w:bottom w:val="single" w:sz="4" w:space="0" w:color="auto"/>
+        <w:right w:val="single" w:sz="4" w:space="0" w:color="auto"/>
+        <w:insideH w:val="single" w:sz="4" w:space="0" w:color="auto"/>
+        <w:insideV w:val="single" w:sz="4" w:space="0" w:color="auto"/>
+      </w:tblBorders>
+    </w:tblPr>
+  </w:style>
 </w:styles>
 </file>
 

</xml_diff>